<commit_message>
updating Zoom link for 2026
</commit_message>
<xml_diff>
--- a/MachineLearning_Syllabus.docx
+++ b/MachineLearning_Syllabus.docx
@@ -237,7 +237,7 @@
         <w:pStyle w:val="FirstParagraph"/>
       </w:pPr>
       <w:r>
-        <w:t xml:space="preserve">Zoom ID for all sessions is 956 7664 4246 (password: 063783), or use the following link:</w:t>
+        <w:t xml:space="preserve">Zoom ID for all sessions is 915 0453 6675 (passcode: 034991), or use the following link:</w:t>
       </w:r>
       <w:r>
         <w:t xml:space="preserve"> </w:t>
@@ -247,7 +247,7 @@
           <w:rPr>
             <w:rStyle w:val="Hyperlink"/>
           </w:rPr>
-          <w:t xml:space="preserve">https://rutgers.zoom.us/j/95676644246?pwd=coPLXHRNqrf8akL5k5mSl19CDIBoiW.1</w:t>
+          <w:t xml:space="preserve">https://rutgers.zoom.us/j/91504536675?pwd=owpXpx2CEOYBKWD4KJvxfQjO37XsT0.1</w:t>
         </w:r>
       </w:hyperlink>
       <w:r>

</xml_diff>

<commit_message>
noting Python companion materials
</commit_message>
<xml_diff>
--- a/MachineLearning_Syllabus.docx
+++ b/MachineLearning_Syllabus.docx
@@ -93,7 +93,22 @@
         <w:t xml:space="preserve"> </w:t>
       </w:r>
       <w:r>
-        <w:t xml:space="preserve">introduction to methods and tools for machine learning for biomedical research. Topics to be included will be model training and validation, regression and regularization, unsupervised learning and clustering, dimension reduction, supervised learning and classification (support vector machines, decision trees, random forests, and gradient boosting), neural networks and deep learning, and modern AI including generative, agentic, and federated approaches. We will generally describe the history, theory, and methods for each approach, discuss appropriate situations for application, and practice and apply computer code for applying each method. The goal of this course is to establish a fundamental understanding and working knowledge of machine learning tools, with less emphasis on mathematical rigor than other courses on campus (e.g., 14:332:443 Machine Learning for Engineers, Department of Electrical and Computer Engineering, Rutgers School of Engineering). This course is also distinct in its application on biomedical data–examples come from a variety of low and high dimensional research problems, such as epidemiology, clinical trials, biomarker discovery, and -omics data analysis. Students will be expected to use R and GitHub throughout this course.</w:t>
+        <w:t xml:space="preserve">introduction to methods and tools for machine learning for biomedical research. Topics to be included will be model training and validation, regression and regularization, unsupervised learning and clustering, dimension reduction, supervised learning and classification (support vector machines, decision trees, random forests, and gradient boosting), neural networks and deep learning, and modern AI including generative, agentic, and federated approaches. We will generally describe the history, theory, and methods for each approach, discuss appropriate situations for application, and practice and apply computer code for applying each method. The goal of this course is to establish a fundamental understanding and working knowledge of machine learning tools, with less emphasis on mathematical rigor than other courses on campus (e.g., 14:332:443 Machine Learning for Engineers, Department of Electrical and Computer Engineering, Rutgers School of Engineering). This course is also distinct in its application on biomedical data–examples come from a variety of low and high dimensional research problems, such as epidemiology, clinical trials, biomarker discovery, and -omics data analysis. The course will be taught in R, and students will be expected to use R and GitHub throughout this course.</w:t>
+      </w:r>
+      <w:r>
+        <w:t xml:space="preserve"> </w:t>
+      </w:r>
+      <w:r>
+        <w:rPr>
+          <w:b/>
+        </w:rPr>
+        <w:t xml:space="preserve">New this semester:</w:t>
+      </w:r>
+      <w:r>
+        <w:t xml:space="preserve"> </w:t>
+      </w:r>
+      <w:r>
+        <w:t xml:space="preserve">we will also be adding companion guides and code in Python, so students can follow along in either language.</w:t>
       </w:r>
     </w:p>
     <w:p>

</xml_diff>

<commit_message>
adding spot checks to grading
</commit_message>
<xml_diff>
--- a/MachineLearning_Syllabus.docx
+++ b/MachineLearning_Syllabus.docx
@@ -7,14 +7,71 @@
         <w:pStyle w:val="Title"/>
       </w:pPr>
       <w:r>
-        <w:t xml:space="preserve">GSND 5355Q </w:t>
-      </w:r>
-      <w:hyperlink r:id="rId9">
+        <w:t xml:space="preserve">GSND</w:t>
+      </w:r>
+      <w:r>
+        <w:t xml:space="preserve"> </w:t>
+      </w:r>
+      <w:r>
+        <w:t xml:space="preserve">5355Q</w:t>
+      </w:r>
+      <w:r>
+        <w:t xml:space="preserve"> </w:t>
+      </w:r>
+      <w:hyperlink r:id="rId20">
         <w:r>
           <w:rPr>
             <w:rStyle w:val="Hyperlink"/>
           </w:rPr>
-          <w:t>Machine Learning for Biomedical Data</w:t>
+          <w:t xml:space="preserve">Machine</w:t>
+        </w:r>
+        <w:r>
+          <w:rPr>
+            <w:rStyle w:val="Hyperlink"/>
+          </w:rPr>
+          <w:t xml:space="preserve"> </w:t>
+        </w:r>
+        <w:r>
+          <w:rPr>
+            <w:rStyle w:val="Hyperlink"/>
+          </w:rPr>
+          <w:t xml:space="preserve">Learning</w:t>
+        </w:r>
+        <w:r>
+          <w:rPr>
+            <w:rStyle w:val="Hyperlink"/>
+          </w:rPr>
+          <w:t xml:space="preserve"> </w:t>
+        </w:r>
+        <w:r>
+          <w:rPr>
+            <w:rStyle w:val="Hyperlink"/>
+          </w:rPr>
+          <w:t xml:space="preserve">for</w:t>
+        </w:r>
+        <w:r>
+          <w:rPr>
+            <w:rStyle w:val="Hyperlink"/>
+          </w:rPr>
+          <w:t xml:space="preserve"> </w:t>
+        </w:r>
+        <w:r>
+          <w:rPr>
+            <w:rStyle w:val="Hyperlink"/>
+          </w:rPr>
+          <w:t xml:space="preserve">Biomedical</w:t>
+        </w:r>
+        <w:r>
+          <w:rPr>
+            <w:rStyle w:val="Hyperlink"/>
+          </w:rPr>
+          <w:t xml:space="preserve"> </w:t>
+        </w:r>
+        <w:r>
+          <w:rPr>
+            <w:rStyle w:val="Hyperlink"/>
+          </w:rPr>
+          <w:t xml:space="preserve">Data</w:t>
         </w:r>
       </w:hyperlink>
     </w:p>
@@ -36,11 +93,11 @@
       <w:pPr>
         <w:pStyle w:val="Heading3"/>
       </w:pPr>
-      <w:bookmarkStart w:id="20" w:name="course-description"/>
+      <w:bookmarkStart w:id="21" w:name="course-description"/>
       <w:r>
         <w:t xml:space="preserve">COURSE DESCRIPTION:</w:t>
       </w:r>
-      <w:bookmarkEnd w:id="20"/>
+      <w:bookmarkEnd w:id="21"/>
     </w:p>
     <w:p>
       <w:pPr>
@@ -87,11 +144,11 @@
       <w:pPr>
         <w:pStyle w:val="Heading3"/>
       </w:pPr>
-      <w:bookmarkStart w:id="21" w:name="course-objectives"/>
+      <w:bookmarkStart w:id="22" w:name="course-objectives"/>
       <w:r>
         <w:t xml:space="preserve">COURSE OBJECTIVES:</w:t>
       </w:r>
-      <w:bookmarkEnd w:id="21"/>
+      <w:bookmarkEnd w:id="22"/>
     </w:p>
     <w:p>
       <w:pPr>
@@ -177,11 +234,11 @@
       <w:pPr>
         <w:pStyle w:val="Heading3"/>
       </w:pPr>
-      <w:bookmarkStart w:id="22" w:name="prerequisites"/>
+      <w:bookmarkStart w:id="23" w:name="prerequisites"/>
       <w:r>
         <w:t xml:space="preserve">PREREQUISITES</w:t>
       </w:r>
-      <w:bookmarkEnd w:id="22"/>
+      <w:bookmarkEnd w:id="23"/>
     </w:p>
     <w:p>
       <w:pPr>
@@ -195,11 +252,11 @@
       <w:pPr>
         <w:pStyle w:val="Heading3"/>
       </w:pPr>
-      <w:bookmarkStart w:id="23" w:name="course-format"/>
+      <w:bookmarkStart w:id="24" w:name="course-format"/>
       <w:r>
         <w:t xml:space="preserve">COURSE FORMAT:</w:t>
       </w:r>
-      <w:bookmarkEnd w:id="23"/>
+      <w:bookmarkEnd w:id="24"/>
     </w:p>
     <w:p>
       <w:pPr>
@@ -213,11 +270,11 @@
       <w:pPr>
         <w:pStyle w:val="Heading3"/>
       </w:pPr>
-      <w:bookmarkStart w:id="24" w:name="zoom-link"/>
+      <w:bookmarkStart w:id="25" w:name="zoom-link"/>
       <w:r>
         <w:t xml:space="preserve">ZOOM Link:</w:t>
       </w:r>
-      <w:bookmarkEnd w:id="24"/>
+      <w:bookmarkEnd w:id="25"/>
     </w:p>
     <w:p>
       <w:pPr>
@@ -229,7 +286,7 @@
       <w:r>
         <w:t xml:space="preserve"> </w:t>
       </w:r>
-      <w:hyperlink r:id="rId25">
+      <w:hyperlink r:id="rId26">
         <w:r>
           <w:rPr>
             <w:rStyle w:val="Hyperlink"/>
@@ -245,11 +302,11 @@
       <w:pPr>
         <w:pStyle w:val="Heading3"/>
       </w:pPr>
-      <w:bookmarkStart w:id="26" w:name="faculty-and-staff"/>
+      <w:bookmarkStart w:id="27" w:name="faculty-and-staff"/>
       <w:r>
         <w:t xml:space="preserve">FACULTY AND STAFF:</w:t>
       </w:r>
-      <w:bookmarkEnd w:id="26"/>
+      <w:bookmarkEnd w:id="27"/>
     </w:p>
     <w:p>
       <w:pPr>
@@ -307,11 +364,11 @@
       <w:pPr>
         <w:pStyle w:val="Heading3"/>
       </w:pPr>
-      <w:bookmarkStart w:id="27" w:name="office-hours"/>
+      <w:bookmarkStart w:id="28" w:name="office-hours"/>
       <w:r>
         <w:t xml:space="preserve">OFFICE HOURS:</w:t>
       </w:r>
-      <w:bookmarkEnd w:id="27"/>
+      <w:bookmarkEnd w:id="28"/>
     </w:p>
     <w:p>
       <w:pPr>
@@ -351,11 +408,11 @@
       <w:pPr>
         <w:pStyle w:val="Heading3"/>
       </w:pPr>
-      <w:bookmarkStart w:id="28" w:name="github-repository"/>
+      <w:bookmarkStart w:id="29" w:name="github-repository"/>
       <w:r>
         <w:t xml:space="preserve">GitHub REPOSITORY:</w:t>
       </w:r>
-      <w:bookmarkEnd w:id="28"/>
+      <w:bookmarkEnd w:id="29"/>
     </w:p>
     <w:p>
       <w:pPr>
@@ -369,11 +426,11 @@
       <w:pPr>
         <w:pStyle w:val="Heading3"/>
       </w:pPr>
-      <w:bookmarkStart w:id="29" w:name="canvas"/>
+      <w:bookmarkStart w:id="30" w:name="canvas"/>
       <w:r>
         <w:t xml:space="preserve">CANVAS:</w:t>
       </w:r>
-      <w:bookmarkEnd w:id="29"/>
+      <w:bookmarkEnd w:id="30"/>
     </w:p>
     <w:p>
       <w:pPr>
@@ -387,11 +444,11 @@
       <w:pPr>
         <w:pStyle w:val="Heading3"/>
       </w:pPr>
-      <w:bookmarkStart w:id="30" w:name="course-textbooks"/>
+      <w:bookmarkStart w:id="31" w:name="course-textbooks"/>
       <w:r>
         <w:t xml:space="preserve">COURSE TEXTBOOKS:</w:t>
       </w:r>
-      <w:bookmarkEnd w:id="30"/>
+      <w:bookmarkEnd w:id="31"/>
     </w:p>
     <w:p>
       <w:pPr>
@@ -495,39 +552,110 @@
       <w:pPr>
         <w:pStyle w:val="Heading3"/>
       </w:pPr>
-      <w:bookmarkStart w:id="31" w:name="evaluation-methods-course-grading"/>
+      <w:bookmarkStart w:id="32" w:name="evaluation-methods-course-grading"/>
       <w:r>
         <w:t xml:space="preserve">EVALUATION METHODS &amp; COURSE GRADING</w:t>
       </w:r>
-      <w:bookmarkEnd w:id="31"/>
+      <w:bookmarkEnd w:id="32"/>
     </w:p>
     <w:p>
       <w:pPr>
         <w:pStyle w:val="Heading4"/>
       </w:pPr>
-      <w:bookmarkStart w:id="32" w:name="assessmentevaluation"/>
+      <w:bookmarkStart w:id="33" w:name="assessmentevaluation"/>
       <w:r>
         <w:t xml:space="preserve">Assessment/Evaluation:</w:t>
       </w:r>
-      <w:bookmarkEnd w:id="32"/>
+      <w:bookmarkEnd w:id="33"/>
     </w:p>
     <w:p>
       <w:pPr>
         <w:pStyle w:val="FirstParagraph"/>
       </w:pPr>
       <w:r>
-        <w:t xml:space="preserve">This course is a hands-on, project-based course. You will be graded based on five homework assignments/mini projects (15% each, total of 75% of grade) and your final project (25%; there will be no final exam). Homework assignments and mini projects will usually be assigned at the beginning of each week and will be due by Wednesday of the week after the material is covered. However, please plan to be flexible on due dates based on the material covered in class.</w:t>
+        <w:t xml:space="preserve">This course is a hands-on, project-based course. Your grade will be based on:</w:t>
+      </w:r>
+    </w:p>
+    <w:p>
+      <w:pPr>
+        <w:numPr>
+          <w:ilvl w:val="0"/>
+          <w:numId w:val="1003"/>
+        </w:numPr>
+        <w:pStyle w:val="Compact"/>
+      </w:pPr>
+      <w:r>
+        <w:rPr>
+          <w:b/>
+        </w:rPr>
+        <w:t xml:space="preserve">Homework assignments/mini projects (50%):</w:t>
+      </w:r>
+      <w:r>
+        <w:t xml:space="preserve"> </w:t>
+      </w:r>
+      <w:r>
+        <w:t xml:space="preserve">five assignments, 10% each. Half of each homework grade is for completion, and half is based on a detailed check of selected problems.</w:t>
+      </w:r>
+    </w:p>
+    <w:p>
+      <w:pPr>
+        <w:numPr>
+          <w:ilvl w:val="0"/>
+          <w:numId w:val="1003"/>
+        </w:numPr>
+        <w:pStyle w:val="Compact"/>
+      </w:pPr>
+      <w:r>
+        <w:rPr>
+          <w:b/>
+        </w:rPr>
+        <w:t xml:space="preserve">Spot checks (25%):</w:t>
+      </w:r>
+      <w:r>
+        <w:t xml:space="preserve"> </w:t>
+      </w:r>
+      <w:r>
+        <w:t xml:space="preserve">two spot checks, each worth 100 points (12.5% each).</w:t>
+      </w:r>
+    </w:p>
+    <w:p>
+      <w:pPr>
+        <w:numPr>
+          <w:ilvl w:val="0"/>
+          <w:numId w:val="1003"/>
+        </w:numPr>
+        <w:pStyle w:val="Compact"/>
+      </w:pPr>
+      <w:r>
+        <w:rPr>
+          <w:b/>
+        </w:rPr>
+        <w:t xml:space="preserve">Final project (25%):</w:t>
+      </w:r>
+      <w:r>
+        <w:t xml:space="preserve"> </w:t>
+      </w:r>
+      <w:r>
+        <w:t xml:space="preserve">there will be no final exam.</w:t>
+      </w:r>
+    </w:p>
+    <w:p>
+      <w:pPr>
+        <w:pStyle w:val="FirstParagraph"/>
+      </w:pPr>
+      <w:r>
+        <w:t xml:space="preserve">Homework assignments and mini projects will usually be assigned at the beginning of each week and will be due by Wednesday of the week after the material is covered. However, please plan to be flexible on due dates based on the material covered in class.</w:t>
       </w:r>
     </w:p>
     <w:p>
       <w:pPr>
         <w:pStyle w:val="Heading4"/>
       </w:pPr>
-      <w:bookmarkStart w:id="33" w:name="use-of-ai-tools"/>
+      <w:bookmarkStart w:id="34" w:name="use-of-ai-tools"/>
       <w:r>
         <w:t xml:space="preserve">Use of AI Tools:</w:t>
       </w:r>
-      <w:bookmarkEnd w:id="33"/>
+      <w:bookmarkEnd w:id="34"/>
     </w:p>
     <w:p>
       <w:pPr>
@@ -541,11 +669,11 @@
       <w:pPr>
         <w:pStyle w:val="Heading4"/>
       </w:pPr>
-      <w:bookmarkStart w:id="34" w:name="course-grading"/>
+      <w:bookmarkStart w:id="35" w:name="course-grading"/>
       <w:r>
         <w:t xml:space="preserve">Course Grading:</w:t>
       </w:r>
-      <w:bookmarkEnd w:id="34"/>
+      <w:bookmarkEnd w:id="35"/>
     </w:p>
     <w:p>
       <w:pPr>
@@ -772,11 +900,11 @@
       <w:pPr>
         <w:pStyle w:val="Heading3"/>
       </w:pPr>
-      <w:bookmarkStart w:id="35" w:name="attendance"/>
+      <w:bookmarkStart w:id="36" w:name="attendance"/>
       <w:r>
         <w:t xml:space="preserve">ATTENDANCE:</w:t>
       </w:r>
-      <w:bookmarkEnd w:id="35"/>
+      <w:bookmarkEnd w:id="36"/>
     </w:p>
     <w:p>
       <w:pPr>
@@ -790,11 +918,11 @@
       <w:pPr>
         <w:pStyle w:val="Heading3"/>
       </w:pPr>
-      <w:bookmarkStart w:id="36" w:name="some-important-dates"/>
+      <w:bookmarkStart w:id="37" w:name="some-important-dates"/>
       <w:r>
         <w:t xml:space="preserve">Some Important Dates:</w:t>
       </w:r>
-      <w:bookmarkEnd w:id="36"/>
+      <w:bookmarkEnd w:id="37"/>
     </w:p>
     <w:p>
       <w:pPr>
@@ -915,11 +1043,11 @@
       <w:pPr>
         <w:pStyle w:val="Heading3"/>
       </w:pPr>
-      <w:bookmarkStart w:id="37" w:name="workload"/>
+      <w:bookmarkStart w:id="38" w:name="workload"/>
       <w:r>
         <w:t xml:space="preserve">WORKLOAD:</w:t>
       </w:r>
-      <w:bookmarkEnd w:id="37"/>
+      <w:bookmarkEnd w:id="38"/>
     </w:p>
     <w:p>
       <w:pPr>
@@ -933,11 +1061,11 @@
       <w:pPr>
         <w:pStyle w:val="Heading3"/>
       </w:pPr>
-      <w:bookmarkStart w:id="38" w:name="other-help"/>
+      <w:bookmarkStart w:id="39" w:name="other-help"/>
       <w:r>
         <w:t xml:space="preserve">OTHER HELP:</w:t>
       </w:r>
-      <w:bookmarkEnd w:id="38"/>
+      <w:bookmarkEnd w:id="39"/>
     </w:p>
     <w:p>
       <w:pPr>
@@ -966,11 +1094,11 @@
       <w:pPr>
         <w:pStyle w:val="Heading3"/>
       </w:pPr>
-      <w:bookmarkStart w:id="39" w:name="academic-integrity"/>
+      <w:bookmarkStart w:id="40" w:name="academic-integrity"/>
       <w:r>
         <w:t xml:space="preserve">ACADEMIC INTEGRITY:</w:t>
       </w:r>
-      <w:bookmarkEnd w:id="39"/>
+      <w:bookmarkEnd w:id="40"/>
     </w:p>
     <w:p>
       <w:pPr>
@@ -984,7 +1112,7 @@
       <w:pPr>
         <w:numPr>
           <w:ilvl w:val="0"/>
-          <w:numId w:val="1003"/>
+          <w:numId w:val="1004"/>
         </w:numPr>
         <w:pStyle w:val="Compact"/>
       </w:pPr>
@@ -996,7 +1124,7 @@
       <w:pPr>
         <w:numPr>
           <w:ilvl w:val="0"/>
-          <w:numId w:val="1003"/>
+          <w:numId w:val="1004"/>
         </w:numPr>
         <w:pStyle w:val="Compact"/>
       </w:pPr>
@@ -1008,7 +1136,7 @@
       <w:pPr>
         <w:numPr>
           <w:ilvl w:val="0"/>
-          <w:numId w:val="1003"/>
+          <w:numId w:val="1004"/>
         </w:numPr>
         <w:pStyle w:val="Compact"/>
       </w:pPr>
@@ -1020,7 +1148,7 @@
       <w:pPr>
         <w:numPr>
           <w:ilvl w:val="0"/>
-          <w:numId w:val="1003"/>
+          <w:numId w:val="1004"/>
         </w:numPr>
         <w:pStyle w:val="Compact"/>
       </w:pPr>
@@ -1045,11 +1173,11 @@
       <w:pPr>
         <w:pStyle w:val="Heading3"/>
       </w:pPr>
-      <w:bookmarkStart w:id="40" w:name="course-topics-and-outline-by-week"/>
+      <w:bookmarkStart w:id="41" w:name="course-topics-and-outline-by-week"/>
       <w:r>
         <w:t xml:space="preserve">COURSE TOPICS AND OUTLINE (BY WEEK)</w:t>
       </w:r>
-      <w:bookmarkEnd w:id="40"/>
+      <w:bookmarkEnd w:id="41"/>
     </w:p>
     <w:p>
       <w:pPr>
@@ -1071,7 +1199,7 @@
       <w:pPr>
         <w:numPr>
           <w:ilvl w:val="0"/>
-          <w:numId w:val="1004"/>
+          <w:numId w:val="1005"/>
         </w:numPr>
         <w:pStyle w:val="Compact"/>
       </w:pPr>
@@ -1083,7 +1211,7 @@
       <w:pPr>
         <w:numPr>
           <w:ilvl w:val="0"/>
-          <w:numId w:val="1004"/>
+          <w:numId w:val="1005"/>
         </w:numPr>
         <w:pStyle w:val="Compact"/>
       </w:pPr>
@@ -1095,7 +1223,7 @@
       <w:pPr>
         <w:numPr>
           <w:ilvl w:val="0"/>
-          <w:numId w:val="1004"/>
+          <w:numId w:val="1005"/>
         </w:numPr>
         <w:pStyle w:val="Compact"/>
       </w:pPr>
@@ -1107,7 +1235,7 @@
       <w:pPr>
         <w:numPr>
           <w:ilvl w:val="0"/>
-          <w:numId w:val="1004"/>
+          <w:numId w:val="1005"/>
         </w:numPr>
         <w:pStyle w:val="Compact"/>
       </w:pPr>
@@ -1127,7 +1255,7 @@
       <w:pPr>
         <w:numPr>
           <w:ilvl w:val="0"/>
-          <w:numId w:val="1005"/>
+          <w:numId w:val="1006"/>
         </w:numPr>
         <w:pStyle w:val="Compact"/>
       </w:pPr>
@@ -1139,7 +1267,7 @@
       <w:pPr>
         <w:numPr>
           <w:ilvl w:val="0"/>
-          <w:numId w:val="1005"/>
+          <w:numId w:val="1006"/>
         </w:numPr>
         <w:pStyle w:val="Compact"/>
       </w:pPr>
@@ -1151,7 +1279,7 @@
       <w:pPr>
         <w:numPr>
           <w:ilvl w:val="0"/>
-          <w:numId w:val="1005"/>
+          <w:numId w:val="1006"/>
         </w:numPr>
         <w:pStyle w:val="Compact"/>
       </w:pPr>
@@ -1171,7 +1299,7 @@
       <w:pPr>
         <w:numPr>
           <w:ilvl w:val="0"/>
-          <w:numId w:val="1006"/>
+          <w:numId w:val="1007"/>
         </w:numPr>
         <w:pStyle w:val="Compact"/>
       </w:pPr>
@@ -1183,7 +1311,7 @@
       <w:pPr>
         <w:numPr>
           <w:ilvl w:val="0"/>
-          <w:numId w:val="1006"/>
+          <w:numId w:val="1007"/>
         </w:numPr>
         <w:pStyle w:val="Compact"/>
       </w:pPr>
@@ -1195,7 +1323,7 @@
       <w:pPr>
         <w:numPr>
           <w:ilvl w:val="0"/>
-          <w:numId w:val="1006"/>
+          <w:numId w:val="1007"/>
         </w:numPr>
         <w:pStyle w:val="Compact"/>
       </w:pPr>
@@ -1207,7 +1335,7 @@
       <w:pPr>
         <w:numPr>
           <w:ilvl w:val="0"/>
-          <w:numId w:val="1006"/>
+          <w:numId w:val="1007"/>
         </w:numPr>
         <w:pStyle w:val="Compact"/>
       </w:pPr>
@@ -1227,7 +1355,7 @@
       <w:pPr>
         <w:numPr>
           <w:ilvl w:val="0"/>
-          <w:numId w:val="1007"/>
+          <w:numId w:val="1008"/>
         </w:numPr>
         <w:pStyle w:val="Compact"/>
       </w:pPr>
@@ -1239,7 +1367,7 @@
       <w:pPr>
         <w:numPr>
           <w:ilvl w:val="0"/>
-          <w:numId w:val="1007"/>
+          <w:numId w:val="1008"/>
         </w:numPr>
         <w:pStyle w:val="Compact"/>
       </w:pPr>
@@ -1251,7 +1379,7 @@
       <w:pPr>
         <w:numPr>
           <w:ilvl w:val="0"/>
-          <w:numId w:val="1007"/>
+          <w:numId w:val="1008"/>
         </w:numPr>
         <w:pStyle w:val="Compact"/>
       </w:pPr>
@@ -1263,7 +1391,7 @@
       <w:pPr>
         <w:numPr>
           <w:ilvl w:val="0"/>
-          <w:numId w:val="1007"/>
+          <w:numId w:val="1008"/>
         </w:numPr>
         <w:pStyle w:val="Compact"/>
       </w:pPr>
@@ -1275,7 +1403,7 @@
       <w:pPr>
         <w:numPr>
           <w:ilvl w:val="0"/>
-          <w:numId w:val="1007"/>
+          <w:numId w:val="1008"/>
         </w:numPr>
         <w:pStyle w:val="Compact"/>
       </w:pPr>
@@ -1295,7 +1423,7 @@
       <w:pPr>
         <w:numPr>
           <w:ilvl w:val="0"/>
-          <w:numId w:val="1008"/>
+          <w:numId w:val="1009"/>
         </w:numPr>
         <w:pStyle w:val="Compact"/>
       </w:pPr>
@@ -1307,7 +1435,7 @@
       <w:pPr>
         <w:numPr>
           <w:ilvl w:val="0"/>
-          <w:numId w:val="1008"/>
+          <w:numId w:val="1009"/>
         </w:numPr>
         <w:pStyle w:val="Compact"/>
       </w:pPr>
@@ -1319,7 +1447,7 @@
       <w:pPr>
         <w:numPr>
           <w:ilvl w:val="0"/>
-          <w:numId w:val="1008"/>
+          <w:numId w:val="1009"/>
         </w:numPr>
         <w:pStyle w:val="Compact"/>
       </w:pPr>
@@ -1339,7 +1467,7 @@
       <w:pPr>
         <w:numPr>
           <w:ilvl w:val="0"/>
-          <w:numId w:val="1009"/>
+          <w:numId w:val="1010"/>
         </w:numPr>
         <w:pStyle w:val="Compact"/>
       </w:pPr>
@@ -1351,7 +1479,7 @@
       <w:pPr>
         <w:numPr>
           <w:ilvl w:val="0"/>
-          <w:numId w:val="1009"/>
+          <w:numId w:val="1010"/>
         </w:numPr>
         <w:pStyle w:val="Compact"/>
       </w:pPr>
@@ -1363,7 +1491,7 @@
       <w:pPr>
         <w:numPr>
           <w:ilvl w:val="0"/>
-          <w:numId w:val="1009"/>
+          <w:numId w:val="1010"/>
         </w:numPr>
         <w:pStyle w:val="Compact"/>
       </w:pPr>
@@ -1375,7 +1503,7 @@
       <w:pPr>
         <w:numPr>
           <w:ilvl w:val="0"/>
-          <w:numId w:val="1009"/>
+          <w:numId w:val="1010"/>
         </w:numPr>
         <w:pStyle w:val="Compact"/>
       </w:pPr>
@@ -1387,7 +1515,7 @@
       <w:pPr>
         <w:numPr>
           <w:ilvl w:val="0"/>
-          <w:numId w:val="1009"/>
+          <w:numId w:val="1010"/>
         </w:numPr>
         <w:pStyle w:val="Compact"/>
       </w:pPr>
@@ -1407,7 +1535,7 @@
       <w:pPr>
         <w:numPr>
           <w:ilvl w:val="0"/>
-          <w:numId w:val="1010"/>
+          <w:numId w:val="1011"/>
         </w:numPr>
         <w:pStyle w:val="Compact"/>
       </w:pPr>
@@ -1419,7 +1547,7 @@
       <w:pPr>
         <w:numPr>
           <w:ilvl w:val="0"/>
-          <w:numId w:val="1010"/>
+          <w:numId w:val="1011"/>
         </w:numPr>
         <w:pStyle w:val="Compact"/>
       </w:pPr>
@@ -1431,7 +1559,7 @@
       <w:pPr>
         <w:numPr>
           <w:ilvl w:val="0"/>
-          <w:numId w:val="1010"/>
+          <w:numId w:val="1011"/>
         </w:numPr>
         <w:pStyle w:val="Compact"/>
       </w:pPr>
@@ -1443,7 +1571,7 @@
       <w:pPr>
         <w:numPr>
           <w:ilvl w:val="0"/>
-          <w:numId w:val="1010"/>
+          <w:numId w:val="1011"/>
         </w:numPr>
         <w:pStyle w:val="Compact"/>
       </w:pPr>
@@ -1463,7 +1591,7 @@
       <w:pPr>
         <w:numPr>
           <w:ilvl w:val="0"/>
-          <w:numId w:val="1011"/>
+          <w:numId w:val="1012"/>
         </w:numPr>
         <w:pStyle w:val="Compact"/>
       </w:pPr>
@@ -1475,7 +1603,7 @@
       <w:pPr>
         <w:numPr>
           <w:ilvl w:val="0"/>
-          <w:numId w:val="1011"/>
+          <w:numId w:val="1012"/>
         </w:numPr>
         <w:pStyle w:val="Compact"/>
       </w:pPr>
@@ -1487,7 +1615,7 @@
       <w:pPr>
         <w:numPr>
           <w:ilvl w:val="0"/>
-          <w:numId w:val="1011"/>
+          <w:numId w:val="1012"/>
         </w:numPr>
         <w:pStyle w:val="Compact"/>
       </w:pPr>
@@ -1499,7 +1627,7 @@
       <w:pPr>
         <w:numPr>
           <w:ilvl w:val="0"/>
-          <w:numId w:val="1011"/>
+          <w:numId w:val="1012"/>
         </w:numPr>
         <w:pStyle w:val="Compact"/>
       </w:pPr>
@@ -1955,6 +2083,9 @@
     <w:abstractNumId w:val="991"/>
   </w:num>
   <w:num w:numId="1011">
+    <w:abstractNumId w:val="991"/>
+  </w:num>
+  <w:num w:numId="1012">
     <w:abstractNumId w:val="991"/>
   </w:num>
 </w:numbering>

</xml_diff>

<commit_message>
updates for lectures and homework
</commit_message>
<xml_diff>
--- a/MachineLearning_Syllabus.docx
+++ b/MachineLearning_Syllabus.docx
@@ -89,15 +89,14 @@
         <w:t xml:space="preserve">2026</w:t>
       </w:r>
     </w:p>
+    <w:bookmarkStart w:id="21" w:name="course-description"/>
     <w:p>
       <w:pPr>
         <w:pStyle w:val="Heading3"/>
       </w:pPr>
-      <w:bookmarkStart w:id="21" w:name="course-description"/>
       <w:r>
         <w:t xml:space="preserve">COURSE DESCRIPTION:</w:t>
       </w:r>
-      <w:bookmarkEnd w:id="21"/>
     </w:p>
     <w:p>
       <w:pPr>
@@ -129,6 +128,7 @@
       </w:r>
       <w:r>
         <w:rPr>
+          <w:bCs/>
           <w:b/>
         </w:rPr>
         <w:t xml:space="preserve">New this semester:</w:t>
@@ -140,15 +140,15 @@
         <w:t xml:space="preserve">we will also be adding companion guides and code in Python, so students can follow along in either language.</w:t>
       </w:r>
     </w:p>
+    <w:bookmarkEnd w:id="21"/>
+    <w:bookmarkStart w:id="22" w:name="course-objectives"/>
     <w:p>
       <w:pPr>
         <w:pStyle w:val="Heading3"/>
       </w:pPr>
-      <w:bookmarkStart w:id="22" w:name="course-objectives"/>
       <w:r>
         <w:t xml:space="preserve">COURSE OBJECTIVES:</w:t>
       </w:r>
-      <w:bookmarkEnd w:id="22"/>
     </w:p>
     <w:p>
       <w:pPr>
@@ -230,15 +230,15 @@
         <w:t xml:space="preserve">Understand the current landscape of AI (predictive, generative, and agentic) and its uses and limitations in biomedical research</w:t>
       </w:r>
     </w:p>
+    <w:bookmarkEnd w:id="22"/>
+    <w:bookmarkStart w:id="23" w:name="prerequisites"/>
     <w:p>
       <w:pPr>
         <w:pStyle w:val="Heading3"/>
       </w:pPr>
-      <w:bookmarkStart w:id="23" w:name="prerequisites"/>
       <w:r>
         <w:t xml:space="preserve">PREREQUISITES</w:t>
       </w:r>
-      <w:bookmarkEnd w:id="23"/>
     </w:p>
     <w:p>
       <w:pPr>
@@ -248,15 +248,15 @@
         <w:t xml:space="preserve">Students should have completed GSND 5345Q: Fundamentals of Data Science or have equivalent experience. A working knowledge of and experience with R or Python is required. An introductory course in statistics, biostatistics, or equivalent experience in statistical analysis is recommended for this course.</w:t>
       </w:r>
     </w:p>
+    <w:bookmarkEnd w:id="23"/>
+    <w:bookmarkStart w:id="24" w:name="course-format"/>
     <w:p>
       <w:pPr>
         <w:pStyle w:val="Heading3"/>
       </w:pPr>
-      <w:bookmarkStart w:id="24" w:name="course-format"/>
       <w:r>
         <w:t xml:space="preserve">COURSE FORMAT:</w:t>
       </w:r>
-      <w:bookmarkEnd w:id="24"/>
     </w:p>
     <w:p>
       <w:pPr>
@@ -266,15 +266,15 @@
         <w:t xml:space="preserve">This class will be taught virtually using a synchronous remote modality: every lecture will be delivered over Zoom. Starting October 21, Room B610 will also be available on Wednesdays for students who want to gather and join the Zoom lecture together. Class will occur Mondays and Wednesdays from 12:00pm-1:50pm. Courses may also be recorded and made available for students who need to miss classes due to personal reasons, illness, or research related needs.</w:t>
       </w:r>
     </w:p>
+    <w:bookmarkEnd w:id="24"/>
+    <w:bookmarkStart w:id="26" w:name="zoom-link"/>
     <w:p>
       <w:pPr>
         <w:pStyle w:val="Heading3"/>
       </w:pPr>
-      <w:bookmarkStart w:id="25" w:name="zoom-link"/>
       <w:r>
         <w:t xml:space="preserve">ZOOM Link:</w:t>
       </w:r>
-      <w:bookmarkEnd w:id="25"/>
     </w:p>
     <w:p>
       <w:pPr>
@@ -286,7 +286,7 @@
       <w:r>
         <w:t xml:space="preserve"> </w:t>
       </w:r>
-      <w:hyperlink r:id="rId26">
+      <w:hyperlink r:id="rId25">
         <w:r>
           <w:rPr>
             <w:rStyle w:val="Hyperlink"/>
@@ -298,15 +298,15 @@
         <w:t xml:space="preserve">. The link is also available through the course GitHub page.</w:t>
       </w:r>
     </w:p>
+    <w:bookmarkEnd w:id="26"/>
+    <w:bookmarkStart w:id="29" w:name="faculty-and-staff"/>
     <w:p>
       <w:pPr>
         <w:pStyle w:val="Heading3"/>
       </w:pPr>
-      <w:bookmarkStart w:id="27" w:name="faculty-and-staff"/>
       <w:r>
         <w:t xml:space="preserve">FACULTY AND STAFF:</w:t>
       </w:r>
-      <w:bookmarkEnd w:id="27"/>
     </w:p>
     <w:p>
       <w:pPr>
@@ -314,6 +314,7 @@
       </w:pPr>
       <w:r>
         <w:rPr>
+          <w:bCs/>
           <w:b/>
         </w:rPr>
         <w:t xml:space="preserve">Instructor:</w:t>
@@ -328,8 +329,19 @@
         <w:br/>
       </w:r>
       <w:r>
-        <w:t xml:space="preserve">Email: w.evan.johnson@rutgers.edu</w:t>
-      </w:r>
+        <w:t xml:space="preserve">Email:</w:t>
+      </w:r>
+      <w:r>
+        <w:t xml:space="preserve"> </w:t>
+      </w:r>
+      <w:hyperlink r:id="rId27">
+        <w:r>
+          <w:rPr>
+            <w:rStyle w:val="Hyperlink"/>
+          </w:rPr>
+          <w:t xml:space="preserve">w.evan.johnson@rutgers.edu</w:t>
+        </w:r>
+      </w:hyperlink>
       <w:r>
         <w:br/>
       </w:r>
@@ -343,6 +355,7 @@
       </w:pPr>
       <w:r>
         <w:rPr>
+          <w:bCs/>
           <w:b/>
         </w:rPr>
         <w:t xml:space="preserve">Teaching Assistant:</w:t>
@@ -357,18 +370,29 @@
         <w:br/>
       </w:r>
       <w:r>
-        <w:t xml:space="preserve">Email: yl2800@gsbs.rutgers.edu</w:t>
-      </w:r>
-    </w:p>
+        <w:t xml:space="preserve">Email:</w:t>
+      </w:r>
+      <w:r>
+        <w:t xml:space="preserve"> </w:t>
+      </w:r>
+      <w:hyperlink r:id="rId28">
+        <w:r>
+          <w:rPr>
+            <w:rStyle w:val="Hyperlink"/>
+          </w:rPr>
+          <w:t xml:space="preserve">yl2800@gsbs.rutgers.edu</w:t>
+        </w:r>
+      </w:hyperlink>
+    </w:p>
+    <w:bookmarkEnd w:id="29"/>
+    <w:bookmarkStart w:id="30" w:name="office-hours"/>
     <w:p>
       <w:pPr>
         <w:pStyle w:val="Heading3"/>
       </w:pPr>
-      <w:bookmarkStart w:id="28" w:name="office-hours"/>
       <w:r>
         <w:t xml:space="preserve">OFFICE HOURS:</w:t>
       </w:r>
-      <w:bookmarkEnd w:id="28"/>
     </w:p>
     <w:p>
       <w:pPr>
@@ -376,6 +400,7 @@
       </w:pPr>
       <w:r>
         <w:rPr>
+          <w:bCs/>
           <w:b/>
         </w:rPr>
         <w:t xml:space="preserve">Instructor:</w:t>
@@ -393,6 +418,7 @@
       </w:pPr>
       <w:r>
         <w:rPr>
+          <w:bCs/>
           <w:b/>
         </w:rPr>
         <w:t xml:space="preserve">Teaching Assistant:</w:t>
@@ -404,33 +430,47 @@
         <w:t xml:space="preserve">Yaoan Leng will be available to help with homework, R/GitHub questions, and final projects. Office hours will be announced on the course GitHub page, or email to set up a time.</w:t>
       </w:r>
     </w:p>
+    <w:bookmarkEnd w:id="30"/>
+    <w:bookmarkStart w:id="32" w:name="github-repository"/>
     <w:p>
       <w:pPr>
         <w:pStyle w:val="Heading3"/>
       </w:pPr>
-      <w:bookmarkStart w:id="29" w:name="github-repository"/>
       <w:r>
         <w:t xml:space="preserve">GitHub REPOSITORY:</w:t>
       </w:r>
-      <w:bookmarkEnd w:id="29"/>
     </w:p>
     <w:p>
       <w:pPr>
         <w:pStyle w:val="FirstParagraph"/>
       </w:pPr>
       <w:r>
-        <w:t xml:space="preserve">The course GitHub repository is located at: https://github.com/wevanjohnson/2026_Fall_MLBD. This page will contain all information in this syllabus plus more. Homework assignments and other information pertinent to this course will be posted on this web site, which will be updated frequently, so you should visit it regularly.</w:t>
-      </w:r>
-    </w:p>
+        <w:t xml:space="preserve">The course GitHub repository is located at:</w:t>
+      </w:r>
+      <w:r>
+        <w:t xml:space="preserve"> </w:t>
+      </w:r>
+      <w:hyperlink r:id="rId31">
+        <w:r>
+          <w:rPr>
+            <w:rStyle w:val="Hyperlink"/>
+          </w:rPr>
+          <w:t xml:space="preserve">https://github.com/wevanjohnson/2026_Fall_MLBD</w:t>
+        </w:r>
+      </w:hyperlink>
+      <w:r>
+        <w:t xml:space="preserve">. This page will contain all information in this syllabus plus more. Homework assignments and other information pertinent to this course will be posted on this web site, which will be updated frequently, so you should visit it regularly.</w:t>
+      </w:r>
+    </w:p>
+    <w:bookmarkEnd w:id="32"/>
+    <w:bookmarkStart w:id="33" w:name="canvas"/>
     <w:p>
       <w:pPr>
         <w:pStyle w:val="Heading3"/>
       </w:pPr>
-      <w:bookmarkStart w:id="30" w:name="canvas"/>
       <w:r>
         <w:t xml:space="preserve">CANVAS:</w:t>
       </w:r>
-      <w:bookmarkEnd w:id="30"/>
     </w:p>
     <w:p>
       <w:pPr>
@@ -440,15 +480,15 @@
         <w:t xml:space="preserve">There will also be a Canvas course page for this course. This is where you will be able to access links to past lectures, and also turn in your homework (and track your HW grades). The rest of the course materials will only be posted on GitHub.</w:t>
       </w:r>
     </w:p>
+    <w:bookmarkEnd w:id="33"/>
+    <w:bookmarkStart w:id="39" w:name="course-textbooks"/>
     <w:p>
       <w:pPr>
         <w:pStyle w:val="Heading3"/>
       </w:pPr>
-      <w:bookmarkStart w:id="31" w:name="course-textbooks"/>
       <w:r>
         <w:t xml:space="preserve">COURSE TEXTBOOKS:</w:t>
       </w:r>
-      <w:bookmarkEnd w:id="31"/>
     </w:p>
     <w:p>
       <w:pPr>
@@ -468,13 +508,25 @@
       </w:pPr>
       <w:r>
         <w:rPr>
+          <w:iCs/>
           <w:i/>
         </w:rPr>
         <w:t xml:space="preserve">Modern Data Science with R</w:t>
       </w:r>
       <w:r>
-        <w:t xml:space="preserve">, 2nd edition, By Benjamin S. Baumer, Daniel T. Kaplan, Nicholas J. Horton, Chapman and Hall/CRC, 2021. https://mdsr-book.github.io/mdsr2e/</w:t>
-      </w:r>
+        <w:t xml:space="preserve">, 2nd edition, By Benjamin S. Baumer, Daniel T. Kaplan, Nicholas J. Horton, Chapman and Hall/CRC, 2021.</w:t>
+      </w:r>
+      <w:r>
+        <w:t xml:space="preserve"> </w:t>
+      </w:r>
+      <w:hyperlink r:id="rId34">
+        <w:r>
+          <w:rPr>
+            <w:rStyle w:val="Hyperlink"/>
+          </w:rPr>
+          <w:t xml:space="preserve">https://mdsr-book.github.io/mdsr2e/</w:t>
+        </w:r>
+      </w:hyperlink>
     </w:p>
     <w:p>
       <w:pPr>
@@ -486,13 +538,25 @@
       </w:pPr>
       <w:r>
         <w:rPr>
+          <w:iCs/>
           <w:i/>
         </w:rPr>
         <w:t xml:space="preserve">Introduction to Data Science: Data Analysis and Prediction Algorithms with R</w:t>
       </w:r>
       <w:r>
-        <w:t xml:space="preserve">, 1st edition, By Rafael A. Irizarry, Chapman and Hall/CRC, 2020. https://rafalab.github.io/dsbook/</w:t>
-      </w:r>
+        <w:t xml:space="preserve">, 1st edition, By Rafael A. Irizarry, Chapman and Hall/CRC, 2020.</w:t>
+      </w:r>
+      <w:r>
+        <w:t xml:space="preserve"> </w:t>
+      </w:r>
+      <w:hyperlink r:id="rId35">
+        <w:r>
+          <w:rPr>
+            <w:rStyle w:val="Hyperlink"/>
+          </w:rPr>
+          <w:t xml:space="preserve">https://rafalab.github.io/dsbook/</w:t>
+        </w:r>
+      </w:hyperlink>
     </w:p>
     <w:p>
       <w:pPr>
@@ -504,13 +568,25 @@
       </w:pPr>
       <w:r>
         <w:rPr>
+          <w:iCs/>
           <w:i/>
         </w:rPr>
         <w:t xml:space="preserve">R for Data Science: Import, Tidy, Transform, Visualize, and Model Data</w:t>
       </w:r>
       <w:r>
-        <w:t xml:space="preserve">, 2nd edition, By Hadley Wickham, Mine Çetinkaya-Rundel, Garrett Grolemund, O’Reilly, 2023. https://r4ds.hadley.nz</w:t>
-      </w:r>
+        <w:t xml:space="preserve">, 2nd edition, By Hadley Wickham, Mine Çetinkaya-Rundel, Garrett Grolemund, O’Reilly, 2023.</w:t>
+      </w:r>
+      <w:r>
+        <w:t xml:space="preserve"> </w:t>
+      </w:r>
+      <w:hyperlink r:id="rId36">
+        <w:r>
+          <w:rPr>
+            <w:rStyle w:val="Hyperlink"/>
+          </w:rPr>
+          <w:t xml:space="preserve">https://r4ds.hadley.nz</w:t>
+        </w:r>
+      </w:hyperlink>
     </w:p>
     <w:p>
       <w:pPr>
@@ -522,12 +598,27 @@
       </w:pPr>
       <w:r>
         <w:rPr>
+          <w:iCs/>
           <w:i/>
         </w:rPr>
         <w:t xml:space="preserve">Mathematical Foundations for Data Analysis</w:t>
       </w:r>
       <w:r>
-        <w:t xml:space="preserve">, By Jeff M. Phillips: https://mathfordata.github.io.</w:t>
+        <w:t xml:space="preserve">, By Jeff M. Phillips:</w:t>
+      </w:r>
+      <w:r>
+        <w:t xml:space="preserve"> </w:t>
+      </w:r>
+      <w:hyperlink r:id="rId37">
+        <w:r>
+          <w:rPr>
+            <w:rStyle w:val="Hyperlink"/>
+          </w:rPr>
+          <w:t xml:space="preserve">https://mathfordata.github.io</w:t>
+        </w:r>
+      </w:hyperlink>
+      <w:r>
+        <w:t xml:space="preserve">.</w:t>
       </w:r>
     </w:p>
     <w:p>
@@ -540,33 +631,44 @@
       </w:pPr>
       <w:r>
         <w:rPr>
+          <w:iCs/>
           <w:i/>
         </w:rPr>
         <w:t xml:space="preserve">The Elements of Statistical Learning</w:t>
       </w:r>
       <w:r>
-        <w:t xml:space="preserve">, 2nd Edition, by Trevor Hastie, Robert Tibshirani, and Jerome Friedman: https://hastie.su.domains/ElemStatLearn/</w:t>
-      </w:r>
-    </w:p>
+        <w:t xml:space="preserve">, 2nd Edition, by Trevor Hastie, Robert Tibshirani, and Jerome Friedman:</w:t>
+      </w:r>
+      <w:r>
+        <w:t xml:space="preserve"> </w:t>
+      </w:r>
+      <w:hyperlink r:id="rId38">
+        <w:r>
+          <w:rPr>
+            <w:rStyle w:val="Hyperlink"/>
+          </w:rPr>
+          <w:t xml:space="preserve">https://hastie.su.domains/ElemStatLearn/</w:t>
+        </w:r>
+      </w:hyperlink>
+    </w:p>
+    <w:bookmarkEnd w:id="39"/>
+    <w:bookmarkStart w:id="43" w:name="evaluation-methods-course-grading"/>
     <w:p>
       <w:pPr>
         <w:pStyle w:val="Heading3"/>
       </w:pPr>
-      <w:bookmarkStart w:id="32" w:name="evaluation-methods-course-grading"/>
       <w:r>
         <w:t xml:space="preserve">EVALUATION METHODS &amp; COURSE GRADING</w:t>
       </w:r>
-      <w:bookmarkEnd w:id="32"/>
-    </w:p>
+    </w:p>
+    <w:bookmarkStart w:id="40" w:name="assessmentevaluation"/>
     <w:p>
       <w:pPr>
         <w:pStyle w:val="Heading4"/>
       </w:pPr>
-      <w:bookmarkStart w:id="33" w:name="assessmentevaluation"/>
       <w:r>
         <w:t xml:space="preserve">Assessment/Evaluation:</w:t>
       </w:r>
-      <w:bookmarkEnd w:id="33"/>
     </w:p>
     <w:p>
       <w:pPr>
@@ -586,6 +688,7 @@
       </w:pPr>
       <w:r>
         <w:rPr>
+          <w:bCs/>
           <w:b/>
         </w:rPr>
         <w:t xml:space="preserve">Homework assignments/mini projects (50%):</w:t>
@@ -607,6 +710,7 @@
       </w:pPr>
       <w:r>
         <w:rPr>
+          <w:bCs/>
           <w:b/>
         </w:rPr>
         <w:t xml:space="preserve">Spot checks (25%):</w:t>
@@ -628,6 +732,7 @@
       </w:pPr>
       <w:r>
         <w:rPr>
+          <w:bCs/>
           <w:b/>
         </w:rPr>
         <w:t xml:space="preserve">Final project (25%):</w:t>
@@ -647,15 +752,15 @@
         <w:t xml:space="preserve">Homework assignments and mini projects will usually be assigned at the beginning of each week and will be due by Wednesday of the week after the material is covered. However, please plan to be flexible on due dates based on the material covered in class.</w:t>
       </w:r>
     </w:p>
+    <w:bookmarkEnd w:id="40"/>
+    <w:bookmarkStart w:id="41" w:name="use-of-ai-tools"/>
     <w:p>
       <w:pPr>
         <w:pStyle w:val="Heading4"/>
       </w:pPr>
-      <w:bookmarkStart w:id="34" w:name="use-of-ai-tools"/>
       <w:r>
         <w:t xml:space="preserve">Use of AI Tools:</w:t>
       </w:r>
-      <w:bookmarkEnd w:id="34"/>
     </w:p>
     <w:p>
       <w:pPr>
@@ -665,15 +770,15 @@
         <w:t xml:space="preserve">Generative AI tools (e.g., ChatGPT, Claude, GitHub Copilot) may be used as aids for coding and learning in this course, and we will discuss them in class. However, you are responsible for understanding, verifying, and being able to explain all code and results you submit. Please briefly note in each assignment how AI tools were used, if at all.</w:t>
       </w:r>
     </w:p>
+    <w:bookmarkEnd w:id="41"/>
+    <w:bookmarkStart w:id="42" w:name="course-grading"/>
     <w:p>
       <w:pPr>
         <w:pStyle w:val="Heading4"/>
       </w:pPr>
-      <w:bookmarkStart w:id="35" w:name="course-grading"/>
       <w:r>
         <w:t xml:space="preserve">Course Grading:</w:t>
       </w:r>
-      <w:bookmarkEnd w:id="35"/>
     </w:p>
     <w:p>
       <w:pPr>
@@ -686,21 +791,25 @@
     <w:tbl>
       <w:tblPr>
         <w:tblStyle w:val="Table"/>
-        <w:tblW w:type="pct" w:w="0.0"/>
-        <w:tblLook w:firstRow="1"/>
+        <w:tblW w:type="auto" w:w="0"/>
+        <w:tblLook w:firstRow="1" w:lastRow="0" w:firstColumn="0" w:lastColumn="0" w:noHBand="0" w:noVBand="0" w:val="0020"/>
+        <w:jc w:val="start"/>
       </w:tblPr>
-      <w:tblGrid/>
+      <w:tblGrid>
+        <w:gridCol w:w="1131"/>
+        <w:gridCol w:w="1131"/>
+        <w:gridCol w:w="1131"/>
+        <w:gridCol w:w="1131"/>
+        <w:gridCol w:w="1131"/>
+        <w:gridCol w:w="1131"/>
+        <w:gridCol w:w="1131"/>
+      </w:tblGrid>
       <w:tr>
         <w:trPr>
-          <w:cnfStyle w:firstRow="1"/>
+          <w:tblHeader w:val="true"/>
         </w:trPr>
         <w:tc>
-          <w:tcPr>
-            <w:tcBorders>
-              <w:bottom w:val="single"/>
-            </w:tcBorders>
-            <w:vAlign w:val="bottom"/>
-          </w:tcPr>
+          <w:tcPr/>
           <w:p>
             <w:pPr>
               <w:pStyle w:val="Compact"/>
@@ -708,18 +817,16 @@
             </w:pPr>
             <m:oMath>
               <m:r>
+                <m:rPr>
+                  <m:sty m:val="p"/>
+                </m:rPr>
                 <m:t>≥</m:t>
               </m:r>
             </m:oMath>
           </w:p>
         </w:tc>
         <w:tc>
-          <w:tcPr>
-            <w:tcBorders>
-              <w:bottom w:val="single"/>
-            </w:tcBorders>
-            <w:vAlign w:val="bottom"/>
-          </w:tcPr>
+          <w:tcPr/>
           <w:p>
             <w:pPr>
               <w:pStyle w:val="Compact"/>
@@ -731,12 +838,7 @@
           </w:p>
         </w:tc>
         <w:tc>
-          <w:tcPr>
-            <w:tcBorders>
-              <w:bottom w:val="single"/>
-            </w:tcBorders>
-            <w:vAlign w:val="bottom"/>
-          </w:tcPr>
+          <w:tcPr/>
           <w:p>
             <w:pPr>
               <w:pStyle w:val="Compact"/>
@@ -748,12 +850,7 @@
           </w:p>
         </w:tc>
         <w:tc>
-          <w:tcPr>
-            <w:tcBorders>
-              <w:bottom w:val="single"/>
-            </w:tcBorders>
-            <w:vAlign w:val="bottom"/>
-          </w:tcPr>
+          <w:tcPr/>
           <w:p>
             <w:pPr>
               <w:pStyle w:val="Compact"/>
@@ -765,12 +862,7 @@
           </w:p>
         </w:tc>
         <w:tc>
-          <w:tcPr>
-            <w:tcBorders>
-              <w:bottom w:val="single"/>
-            </w:tcBorders>
-            <w:vAlign w:val="bottom"/>
-          </w:tcPr>
+          <w:tcPr/>
           <w:p>
             <w:pPr>
               <w:pStyle w:val="Compact"/>
@@ -782,12 +874,7 @@
           </w:p>
         </w:tc>
         <w:tc>
-          <w:tcPr>
-            <w:tcBorders>
-              <w:bottom w:val="single"/>
-            </w:tcBorders>
-            <w:vAlign w:val="bottom"/>
-          </w:tcPr>
+          <w:tcPr/>
           <w:p>
             <w:pPr>
               <w:pStyle w:val="Compact"/>
@@ -799,12 +886,7 @@
           </w:p>
         </w:tc>
         <w:tc>
-          <w:tcPr>
-            <w:tcBorders>
-              <w:bottom w:val="single"/>
-            </w:tcBorders>
-            <w:vAlign w:val="bottom"/>
-          </w:tcPr>
+          <w:tcPr/>
           <w:p>
             <w:pPr>
               <w:pStyle w:val="Compact"/>
@@ -818,6 +900,7 @@
       </w:tr>
       <w:tr>
         <w:tc>
+          <w:tcPr/>
           <w:p>
             <w:pPr>
               <w:pStyle w:val="Compact"/>
@@ -829,6 +912,7 @@
           </w:p>
         </w:tc>
         <w:tc>
+          <w:tcPr/>
           <w:p>
             <w:pPr>
               <w:pStyle w:val="Compact"/>
@@ -840,6 +924,7 @@
           </w:p>
         </w:tc>
         <w:tc>
+          <w:tcPr/>
           <w:p>
             <w:pPr>
               <w:pStyle w:val="Compact"/>
@@ -851,6 +936,7 @@
           </w:p>
         </w:tc>
         <w:tc>
+          <w:tcPr/>
           <w:p>
             <w:pPr>
               <w:pStyle w:val="Compact"/>
@@ -862,6 +948,7 @@
           </w:p>
         </w:tc>
         <w:tc>
+          <w:tcPr/>
           <w:p>
             <w:pPr>
               <w:pStyle w:val="Compact"/>
@@ -873,6 +960,7 @@
           </w:p>
         </w:tc>
         <w:tc>
+          <w:tcPr/>
           <w:p>
             <w:pPr>
               <w:pStyle w:val="Compact"/>
@@ -884,6 +972,7 @@
           </w:p>
         </w:tc>
         <w:tc>
+          <w:tcPr/>
           <w:p>
             <w:pPr>
               <w:pStyle w:val="Compact"/>
@@ -896,15 +985,16 @@
         </w:tc>
       </w:tr>
     </w:tbl>
+    <w:bookmarkEnd w:id="42"/>
+    <w:bookmarkEnd w:id="43"/>
+    <w:bookmarkStart w:id="44" w:name="attendance"/>
     <w:p>
       <w:pPr>
         <w:pStyle w:val="Heading3"/>
       </w:pPr>
-      <w:bookmarkStart w:id="36" w:name="attendance"/>
       <w:r>
         <w:t xml:space="preserve">ATTENDANCE:</w:t>
       </w:r>
-      <w:bookmarkEnd w:id="36"/>
     </w:p>
     <w:p>
       <w:pPr>
@@ -914,29 +1004,47 @@
         <w:t xml:space="preserve">This course is being taught through a synchronous remote modality through Zoom. Attendance is mandatory; lecture recordings will only be available to students with university approved absences or pre-approved special circumstances. If you are sick or have any other justified reason to miss a lecture, please reach out to Dr. Johnson in advance and you will be reasonably accommodated.</w:t>
       </w:r>
     </w:p>
+    <w:bookmarkEnd w:id="44"/>
+    <w:bookmarkStart w:id="46" w:name="some-important-dates"/>
     <w:p>
       <w:pPr>
         <w:pStyle w:val="Heading3"/>
       </w:pPr>
-      <w:bookmarkStart w:id="37" w:name="some-important-dates"/>
       <w:r>
         <w:t xml:space="preserve">Some Important Dates:</w:t>
       </w:r>
-      <w:bookmarkEnd w:id="37"/>
     </w:p>
     <w:p>
       <w:pPr>
         <w:pStyle w:val="FirstParagraph"/>
       </w:pPr>
       <w:r>
-        <w:t xml:space="preserve">(See https://njms.rutgers.edu/sgs/current_students/ for more)</w:t>
+        <w:t xml:space="preserve">(See</w:t>
+      </w:r>
+      <w:r>
+        <w:t xml:space="preserve"> </w:t>
+      </w:r>
+      <w:hyperlink r:id="rId45">
+        <w:r>
+          <w:rPr>
+            <w:rStyle w:val="Hyperlink"/>
+          </w:rPr>
+          <w:t xml:space="preserve">https://njms.rutgers.edu/sgs/current_students/</w:t>
+        </w:r>
+      </w:hyperlink>
+      <w:r>
+        <w:t xml:space="preserve"> </w:t>
+      </w:r>
+      <w:r>
+        <w:t xml:space="preserve">for more)</w:t>
       </w:r>
     </w:p>
     <w:tbl>
       <w:tblPr>
         <w:tblStyle w:val="Table"/>
-        <w:tblW w:type="pct" w:w="5000.0"/>
-        <w:tblLook w:firstRow="0"/>
+        <w:tblW w:type="pct" w:w="5000"/>
+        <w:tblLook w:firstRow="0" w:lastRow="0" w:firstColumn="0" w:lastColumn="0" w:noHBand="0" w:noVBand="0" w:val="0000"/>
+        <w:jc w:val="start"/>
       </w:tblPr>
       <w:tblGrid>
         <w:gridCol w:w="3465"/>
@@ -944,6 +1052,7 @@
       </w:tblGrid>
       <w:tr>
         <w:tc>
+          <w:tcPr/>
           <w:p>
             <w:pPr>
               <w:pStyle w:val="Compact"/>
@@ -955,6 +1064,7 @@
           </w:p>
         </w:tc>
         <w:tc>
+          <w:tcPr/>
           <w:p>
             <w:pPr>
               <w:pStyle w:val="Compact"/>
@@ -968,6 +1078,7 @@
       </w:tr>
       <w:tr>
         <w:tc>
+          <w:tcPr/>
           <w:p>
             <w:pPr>
               <w:pStyle w:val="Compact"/>
@@ -979,6 +1090,7 @@
           </w:p>
         </w:tc>
         <w:tc>
+          <w:tcPr/>
           <w:p>
             <w:pPr>
               <w:pStyle w:val="Compact"/>
@@ -992,6 +1104,7 @@
       </w:tr>
       <w:tr>
         <w:tc>
+          <w:tcPr/>
           <w:p>
             <w:pPr>
               <w:pStyle w:val="Compact"/>
@@ -1003,6 +1116,7 @@
           </w:p>
         </w:tc>
         <w:tc>
+          <w:tcPr/>
           <w:p>
             <w:pPr>
               <w:pStyle w:val="Compact"/>
@@ -1016,6 +1130,7 @@
       </w:tr>
       <w:tr>
         <w:tc>
+          <w:tcPr/>
           <w:p>
             <w:pPr>
               <w:pStyle w:val="Compact"/>
@@ -1027,6 +1142,7 @@
           </w:p>
         </w:tc>
         <w:tc>
+          <w:tcPr/>
           <w:p>
             <w:pPr>
               <w:pStyle w:val="Compact"/>
@@ -1039,15 +1155,15 @@
         </w:tc>
       </w:tr>
     </w:tbl>
+    <w:bookmarkEnd w:id="46"/>
+    <w:bookmarkStart w:id="47" w:name="workload"/>
     <w:p>
       <w:pPr>
         <w:pStyle w:val="Heading3"/>
       </w:pPr>
-      <w:bookmarkStart w:id="38" w:name="workload"/>
       <w:r>
         <w:t xml:space="preserve">WORKLOAD:</w:t>
       </w:r>
-      <w:bookmarkEnd w:id="38"/>
     </w:p>
     <w:p>
       <w:pPr>
@@ -1057,15 +1173,15 @@
         <w:t xml:space="preserve">This is a 2.0 credit class in the Fall 2 session. In general, you should expect four hours of in class each week, and two hours outside of class for every hour in class.</w:t>
       </w:r>
     </w:p>
+    <w:bookmarkEnd w:id="47"/>
+    <w:bookmarkStart w:id="48" w:name="other-help"/>
     <w:p>
       <w:pPr>
         <w:pStyle w:val="Heading3"/>
       </w:pPr>
-      <w:bookmarkStart w:id="39" w:name="other-help"/>
       <w:r>
         <w:t xml:space="preserve">OTHER HELP:</w:t>
       </w:r>
-      <w:bookmarkEnd w:id="39"/>
     </w:p>
     <w:p>
       <w:pPr>
@@ -1079,6 +1195,7 @@
       </w:r>
       <w:r>
         <w:rPr>
+          <w:bCs/>
           <w:b/>
         </w:rPr>
         <w:t xml:space="preserve">strongly</w:t>
@@ -1090,22 +1207,36 @@
         <w:t xml:space="preserve">encourage you to contact me early if you have difficulty with the material. This course builds on material from prior lectures, so do not fall behind! My job is to help you understand the material as well as possible, and I am flexible with meeting times.</w:t>
       </w:r>
     </w:p>
+    <w:bookmarkEnd w:id="48"/>
+    <w:bookmarkStart w:id="51" w:name="academic-integrity"/>
     <w:p>
       <w:pPr>
         <w:pStyle w:val="Heading3"/>
       </w:pPr>
-      <w:bookmarkStart w:id="40" w:name="academic-integrity"/>
       <w:r>
         <w:t xml:space="preserve">ACADEMIC INTEGRITY:</w:t>
       </w:r>
-      <w:bookmarkEnd w:id="40"/>
     </w:p>
     <w:p>
       <w:pPr>
         <w:pStyle w:val="FirstParagraph"/>
       </w:pPr>
       <w:r>
-        <w:t xml:space="preserve">You are expected to have read and follow the guidelines at the university’s academic integrity website (http://academicintegrity.rutgers.edu ). These principles forbid plagiarism and require that every Rutgers University student:</w:t>
+        <w:t xml:space="preserve">You are expected to have read and follow the guidelines at the university’s academic integrity website (</w:t>
+      </w:r>
+      <w:hyperlink r:id="rId49">
+        <w:r>
+          <w:rPr>
+            <w:rStyle w:val="Hyperlink"/>
+          </w:rPr>
+          <w:t xml:space="preserve">http://academicintegrity.rutgers.edu</w:t>
+        </w:r>
+      </w:hyperlink>
+      <w:r>
+        <w:t xml:space="preserve"> </w:t>
+      </w:r>
+      <w:r>
+        <w:t xml:space="preserve">). These principles forbid plagiarism and require that every Rutgers University student:</w:t>
       </w:r>
     </w:p>
     <w:p>
@@ -1153,7 +1284,24 @@
         <w:pStyle w:val="Compact"/>
       </w:pPr>
       <w:r>
-        <w:t xml:space="preserve">Treat all other students in an ethical manner, respecting their integrity and right to pursue their educational goals without interference. This requires that a student neither facilitate academic dishonesty by others nor obstruct their academic progress (reproduced from: http://academicintegrity.rutgers.edu/academic-integrity-at-rutgers/ ).</w:t>
+        <w:t xml:space="preserve">Treat all other students in an ethical manner, respecting their integrity and right to pursue their educational goals without interference. This requires that a student neither facilitate academic dishonesty by others nor obstruct their academic progress (reproduced from:</w:t>
+      </w:r>
+      <w:r>
+        <w:t xml:space="preserve"> </w:t>
+      </w:r>
+      <w:hyperlink r:id="rId50">
+        <w:r>
+          <w:rPr>
+            <w:rStyle w:val="Hyperlink"/>
+          </w:rPr>
+          <w:t xml:space="preserve">http://academicintegrity.rutgers.edu/academic-integrity-at-rutgers/</w:t>
+        </w:r>
+      </w:hyperlink>
+      <w:r>
+        <w:t xml:space="preserve"> </w:t>
+      </w:r>
+      <w:r>
+        <w:t xml:space="preserve">).</w:t>
       </w:r>
     </w:p>
     <w:p>
@@ -1169,15 +1317,15 @@
         <w:br w:type="page"/>
       </w:r>
     </w:p>
+    <w:bookmarkEnd w:id="51"/>
+    <w:bookmarkStart w:id="52" w:name="course-topics-and-outline-by-week"/>
     <w:p>
       <w:pPr>
         <w:pStyle w:val="Heading3"/>
       </w:pPr>
-      <w:bookmarkStart w:id="41" w:name="course-topics-and-outline-by-week"/>
       <w:r>
         <w:t xml:space="preserve">COURSE TOPICS AND OUTLINE (BY WEEK)</w:t>
       </w:r>
-      <w:bookmarkEnd w:id="41"/>
     </w:p>
     <w:p>
       <w:pPr>
@@ -1248,7 +1396,7 @@
         <w:pStyle w:val="FirstParagraph"/>
       </w:pPr>
       <w:r>
-        <w:t xml:space="preserve">Tools for machine learning (Oct 21, 26)</w:t>
+        <w:t xml:space="preserve">Tools for machine learning (Oct 21)</w:t>
       </w:r>
     </w:p>
     <w:p>
@@ -1292,7 +1440,7 @@
         <w:pStyle w:val="FirstParagraph"/>
       </w:pPr>
       <w:r>
-        <w:t xml:space="preserve">Regression and regularization (Oct 28, Nov 2)</w:t>
+        <w:t xml:space="preserve">Regression and regularization (Oct 26, 28)</w:t>
       </w:r>
     </w:p>
     <w:p>
@@ -1348,7 +1496,7 @@
         <w:pStyle w:val="FirstParagraph"/>
       </w:pPr>
       <w:r>
-        <w:t xml:space="preserve">Unsupervised learning and dimension reduction (Nov 4, 9)</w:t>
+        <w:t xml:space="preserve">Unsupervised learning and dimension reduction (Nov 2, 4)</w:t>
       </w:r>
     </w:p>
     <w:p>
@@ -1416,7 +1564,7 @@
         <w:pStyle w:val="FirstParagraph"/>
       </w:pPr>
       <w:r>
-        <w:t xml:space="preserve">Support vector machines (Nov 11, 16)</w:t>
+        <w:t xml:space="preserve">Support vector machines (Nov 9, 11)</w:t>
       </w:r>
     </w:p>
     <w:p>
@@ -1445,22 +1593,10 @@
     </w:p>
     <w:p>
       <w:pPr>
-        <w:numPr>
-          <w:ilvl w:val="0"/>
-          <w:numId w:val="1009"/>
-        </w:numPr>
-        <w:pStyle w:val="Compact"/>
-      </w:pPr>
-      <w:r>
-        <w:t xml:space="preserve">Nov 16: pre-recorded lecture (no live session)</w:t>
-      </w:r>
-    </w:p>
-    <w:p>
-      <w:pPr>
         <w:pStyle w:val="FirstParagraph"/>
       </w:pPr>
       <w:r>
-        <w:t xml:space="preserve">Trees and ensemble methods (Nov 18, 23, 25)</w:t>
+        <w:t xml:space="preserve">Trees and ensemble methods (Nov 16, 18, 23)</w:t>
       </w:r>
     </w:p>
     <w:p>
@@ -1520,7 +1656,7 @@
         <w:pStyle w:val="Compact"/>
       </w:pPr>
       <w:r>
-        <w:t xml:space="preserve">Nov 18: pre-recorded lecture (no live session)</w:t>
+        <w:t xml:space="preserve">Nov 16 and 18: pre-recorded lectures (no live session)</w:t>
       </w:r>
     </w:p>
     <w:p>
@@ -1528,7 +1664,7 @@
         <w:pStyle w:val="FirstParagraph"/>
       </w:pPr>
       <w:r>
-        <w:t xml:space="preserve">Neural networks and deep learning (Nov 30, Dec 2)</w:t>
+        <w:t xml:space="preserve">Neural networks and deep learning (Nov 25, 30)</w:t>
       </w:r>
     </w:p>
     <w:p>
@@ -1584,7 +1720,7 @@
         <w:pStyle w:val="FirstParagraph"/>
       </w:pPr>
       <w:r>
-        <w:t xml:space="preserve">Modern AI in biomedicine (Dec 7, 9)</w:t>
+        <w:t xml:space="preserve">Modern AI in biomedicine (Dec 2, 7, 9)</w:t>
       </w:r>
     </w:p>
     <w:p>
@@ -1643,11 +1779,8 @@
         <w:t xml:space="preserve">Final project presentations (Dec 14, 16)</w:t>
       </w:r>
     </w:p>
-    <w:sectPr>
-      <w:footnotePr>
-        <w:numRestart w:val="eachSect"/>
-      </w:footnotePr>
-    </w:sectPr>
+    <w:bookmarkEnd w:id="52"/>
+    <w:sectPr/>
   </w:body>
 </w:document>
 </file>
@@ -1678,17 +1811,14 @@
 <file path=word/numbering.xml><?xml version="1.0" encoding="utf-8"?>
 <w:numbering xmlns:w="http://schemas.openxmlformats.org/wordprocessingml/2006/main">
   <w:abstractNum w:abstractNumId="990">
-    <w:nsid w:val="2c1ae401"/>
+    <w:nsid w:val="A990"/>
     <w:multiLevelType w:val="multilevel"/>
     <w:lvl w:ilvl="0">
       <w:numFmt w:val="bullet"/>
       <w:lvlText w:val=" "/>
       <w:lvlJc w:val="left"/>
       <w:pPr>
-        <w:tabs>
-          <w:tab w:val="num" w:pos="0"/>
-        </w:tabs>
-        <w:ind w:left="480" w:hanging="480"/>
+        <w:ind w:left="720" w:hanging="480"/>
       </w:pPr>
     </w:lvl>
     <w:lvl w:ilvl="1">
@@ -1696,10 +1826,7 @@
       <w:lvlText w:val=" "/>
       <w:lvlJc w:val="left"/>
       <w:pPr>
-        <w:tabs>
-          <w:tab w:val="num" w:pos="720"/>
-        </w:tabs>
-        <w:ind w:left="1200" w:hanging="480"/>
+        <w:ind w:left="1440" w:hanging="480"/>
       </w:pPr>
     </w:lvl>
     <w:lvl w:ilvl="2">
@@ -1707,10 +1834,7 @@
       <w:lvlText w:val=" "/>
       <w:lvlJc w:val="left"/>
       <w:pPr>
-        <w:tabs>
-          <w:tab w:val="num" w:pos="1440"/>
-        </w:tabs>
-        <w:ind w:left="1920" w:hanging="480"/>
+        <w:ind w:left="2160" w:hanging="480"/>
       </w:pPr>
     </w:lvl>
     <w:lvl w:ilvl="3">
@@ -1718,10 +1842,7 @@
       <w:lvlText w:val=" "/>
       <w:lvlJc w:val="left"/>
       <w:pPr>
-        <w:tabs>
-          <w:tab w:val="num" w:pos="2160"/>
-        </w:tabs>
-        <w:ind w:left="2640" w:hanging="480"/>
+        <w:ind w:left="2880" w:hanging="480"/>
       </w:pPr>
     </w:lvl>
     <w:lvl w:ilvl="4">
@@ -1729,10 +1850,7 @@
       <w:lvlText w:val=" "/>
       <w:lvlJc w:val="left"/>
       <w:pPr>
-        <w:tabs>
-          <w:tab w:val="num" w:pos="2880"/>
-        </w:tabs>
-        <w:ind w:left="3360" w:hanging="480"/>
+        <w:ind w:left="3600" w:hanging="480"/>
       </w:pPr>
     </w:lvl>
     <w:lvl w:ilvl="5">
@@ -1740,10 +1858,7 @@
       <w:lvlText w:val=" "/>
       <w:lvlJc w:val="left"/>
       <w:pPr>
-        <w:tabs>
-          <w:tab w:val="num" w:pos="3600"/>
-        </w:tabs>
-        <w:ind w:left="4080" w:hanging="480"/>
+        <w:ind w:left="4320" w:hanging="480"/>
       </w:pPr>
     </w:lvl>
     <w:lvl w:ilvl="6">
@@ -1751,10 +1866,7 @@
       <w:lvlText w:val=" "/>
       <w:lvlJc w:val="left"/>
       <w:pPr>
-        <w:tabs>
-          <w:tab w:val="num" w:pos="4320"/>
-        </w:tabs>
-        <w:ind w:left="4800" w:hanging="480"/>
+        <w:ind w:left="5040" w:hanging="480"/>
       </w:pPr>
     </w:lvl>
     <w:lvl w:ilvl="7">
@@ -1762,10 +1874,7 @@
       <w:lvlText w:val=" "/>
       <w:lvlJc w:val="left"/>
       <w:pPr>
-        <w:tabs>
-          <w:tab w:val="num" w:pos="5040"/>
-        </w:tabs>
-        <w:ind w:left="5520" w:hanging="480"/>
+        <w:ind w:left="5760" w:hanging="480"/>
       </w:pPr>
     </w:lvl>
     <w:lvl w:ilvl="8">
@@ -1773,15 +1882,12 @@
       <w:lvlText w:val=" "/>
       <w:lvlJc w:val="left"/>
       <w:pPr>
-        <w:tabs>
-          <w:tab w:val="num" w:pos="5760"/>
-        </w:tabs>
-        <w:ind w:left="6240" w:hanging="480"/>
+        <w:ind w:left="6480" w:hanging="480"/>
       </w:pPr>
     </w:lvl>
   </w:abstractNum>
   <w:abstractNum w:abstractNumId="99411">
-    <w:nsid w:val="ea454b4c"/>
+    <w:nsid w:val="A99411"/>
     <w:multiLevelType w:val="multilevel"/>
     <w:lvl w:ilvl="0">
       <w:start w:val="1"/>
@@ -1789,10 +1895,7 @@
       <w:lvlText w:val="%1."/>
       <w:lvlJc w:val="left"/>
       <w:pPr>
-        <w:tabs>
-          <w:tab w:val="num" w:pos="0"/>
-        </w:tabs>
-        <w:ind w:left="480" w:hanging="480"/>
+        <w:ind w:left="720" w:hanging="480"/>
       </w:pPr>
     </w:lvl>
     <w:lvl w:ilvl="1">
@@ -1801,10 +1904,7 @@
       <w:lvlText w:val="%2."/>
       <w:lvlJc w:val="left"/>
       <w:pPr>
-        <w:tabs>
-          <w:tab w:val="num" w:pos="720"/>
-        </w:tabs>
-        <w:ind w:left="1200" w:hanging="480"/>
+        <w:ind w:left="1440" w:hanging="480"/>
       </w:pPr>
     </w:lvl>
     <w:lvl w:ilvl="2">
@@ -1813,10 +1913,7 @@
       <w:lvlText w:val="%3."/>
       <w:lvlJc w:val="left"/>
       <w:pPr>
-        <w:tabs>
-          <w:tab w:val="num" w:pos="1440"/>
-        </w:tabs>
-        <w:ind w:left="1920" w:hanging="480"/>
+        <w:ind w:left="2160" w:hanging="480"/>
       </w:pPr>
     </w:lvl>
     <w:lvl w:ilvl="3">
@@ -1825,10 +1922,7 @@
       <w:lvlText w:val="%4."/>
       <w:lvlJc w:val="left"/>
       <w:pPr>
-        <w:tabs>
-          <w:tab w:val="num" w:pos="2160"/>
-        </w:tabs>
-        <w:ind w:left="2640" w:hanging="480"/>
+        <w:ind w:left="2880" w:hanging="480"/>
       </w:pPr>
     </w:lvl>
     <w:lvl w:ilvl="4">
@@ -1837,10 +1931,7 @@
       <w:lvlText w:val="%5."/>
       <w:lvlJc w:val="left"/>
       <w:pPr>
-        <w:tabs>
-          <w:tab w:val="num" w:pos="2880"/>
-        </w:tabs>
-        <w:ind w:left="3360" w:hanging="480"/>
+        <w:ind w:left="3600" w:hanging="480"/>
       </w:pPr>
     </w:lvl>
     <w:lvl w:ilvl="5">
@@ -1849,10 +1940,7 @@
       <w:lvlText w:val="%6."/>
       <w:lvlJc w:val="left"/>
       <w:pPr>
-        <w:tabs>
-          <w:tab w:val="num" w:pos="3600"/>
-        </w:tabs>
-        <w:ind w:left="4080" w:hanging="480"/>
+        <w:ind w:left="4320" w:hanging="480"/>
       </w:pPr>
     </w:lvl>
     <w:lvl w:ilvl="6">
@@ -1861,10 +1949,7 @@
       <w:lvlText w:val="%7."/>
       <w:lvlJc w:val="left"/>
       <w:pPr>
-        <w:tabs>
-          <w:tab w:val="num" w:pos="4320"/>
-        </w:tabs>
-        <w:ind w:left="4800" w:hanging="480"/>
+        <w:ind w:left="5040" w:hanging="480"/>
       </w:pPr>
     </w:lvl>
     <w:lvl w:ilvl="7">
@@ -1873,10 +1958,7 @@
       <w:lvlText w:val="%8."/>
       <w:lvlJc w:val="left"/>
       <w:pPr>
-        <w:tabs>
-          <w:tab w:val="num" w:pos="5040"/>
-        </w:tabs>
-        <w:ind w:left="5520" w:hanging="480"/>
+        <w:ind w:left="5760" w:hanging="480"/>
       </w:pPr>
     </w:lvl>
     <w:lvl w:ilvl="8">
@@ -1885,25 +1967,19 @@
       <w:lvlText w:val="%9."/>
       <w:lvlJc w:val="left"/>
       <w:pPr>
-        <w:tabs>
-          <w:tab w:val="num" w:pos="5760"/>
-        </w:tabs>
-        <w:ind w:left="6240" w:hanging="480"/>
+        <w:ind w:left="6480" w:hanging="480"/>
       </w:pPr>
     </w:lvl>
   </w:abstractNum>
   <w:abstractNum w:abstractNumId="991">
-    <w:nsid w:val="71315dca"/>
+    <w:nsid w:val="A991"/>
     <w:multiLevelType w:val="multilevel"/>
     <w:lvl w:ilvl="0">
       <w:numFmt w:val="bullet"/>
       <w:lvlText w:val="•"/>
       <w:lvlJc w:val="left"/>
       <w:pPr>
-        <w:tabs>
-          <w:tab w:val="num" w:pos="0"/>
-        </w:tabs>
-        <w:ind w:left="480" w:hanging="480"/>
+        <w:ind w:left="720" w:hanging="480"/>
       </w:pPr>
     </w:lvl>
     <w:lvl w:ilvl="1">
@@ -1911,10 +1987,7 @@
       <w:lvlText w:val="–"/>
       <w:lvlJc w:val="left"/>
       <w:pPr>
-        <w:tabs>
-          <w:tab w:val="num" w:pos="720"/>
-        </w:tabs>
-        <w:ind w:left="1200" w:hanging="480"/>
+        <w:ind w:left="1440" w:hanging="480"/>
       </w:pPr>
     </w:lvl>
     <w:lvl w:ilvl="2">
@@ -1922,10 +1995,7 @@
       <w:lvlText w:val="•"/>
       <w:lvlJc w:val="left"/>
       <w:pPr>
-        <w:tabs>
-          <w:tab w:val="num" w:pos="1440"/>
-        </w:tabs>
-        <w:ind w:left="1920" w:hanging="480"/>
+        <w:ind w:left="2160" w:hanging="480"/>
       </w:pPr>
     </w:lvl>
     <w:lvl w:ilvl="3">
@@ -1933,10 +2003,7 @@
       <w:lvlText w:val="–"/>
       <w:lvlJc w:val="left"/>
       <w:pPr>
-        <w:tabs>
-          <w:tab w:val="num" w:pos="2160"/>
-        </w:tabs>
-        <w:ind w:left="2640" w:hanging="480"/>
+        <w:ind w:left="2880" w:hanging="480"/>
       </w:pPr>
     </w:lvl>
     <w:lvl w:ilvl="4">
@@ -1944,10 +2011,7 @@
       <w:lvlText w:val="•"/>
       <w:lvlJc w:val="left"/>
       <w:pPr>
-        <w:tabs>
-          <w:tab w:val="num" w:pos="2880"/>
-        </w:tabs>
-        <w:ind w:left="3360" w:hanging="480"/>
+        <w:ind w:left="3600" w:hanging="480"/>
       </w:pPr>
     </w:lvl>
     <w:lvl w:ilvl="5">
@@ -1955,10 +2019,7 @@
       <w:lvlText w:val="–"/>
       <w:lvlJc w:val="left"/>
       <w:pPr>
-        <w:tabs>
-          <w:tab w:val="num" w:pos="3600"/>
-        </w:tabs>
-        <w:ind w:left="4080" w:hanging="480"/>
+        <w:ind w:left="4320" w:hanging="480"/>
       </w:pPr>
     </w:lvl>
     <w:lvl w:ilvl="6">
@@ -1966,10 +2027,7 @@
       <w:lvlText w:val="•"/>
       <w:lvlJc w:val="left"/>
       <w:pPr>
-        <w:tabs>
-          <w:tab w:val="num" w:pos="4320"/>
-        </w:tabs>
-        <w:ind w:left="4800" w:hanging="480"/>
+        <w:ind w:left="5040" w:hanging="480"/>
       </w:pPr>
     </w:lvl>
     <w:lvl w:ilvl="7">
@@ -1977,10 +2035,7 @@
       <w:lvlText w:val="–"/>
       <w:lvlJc w:val="left"/>
       <w:pPr>
-        <w:tabs>
-          <w:tab w:val="num" w:pos="5040"/>
-        </w:tabs>
-        <w:ind w:left="5520" w:hanging="480"/>
+        <w:ind w:left="5760" w:hanging="480"/>
       </w:pPr>
     </w:lvl>
     <w:lvl w:ilvl="8">
@@ -1988,10 +2043,7 @@
       <w:lvlText w:val="•"/>
       <w:lvlJc w:val="left"/>
       <w:pPr>
-        <w:tabs>
-          <w:tab w:val="num" w:pos="5760"/>
-        </w:tabs>
-        <w:ind w:left="6240" w:hanging="480"/>
+        <w:ind w:left="6480" w:hanging="480"/>
       </w:pPr>
     </w:lvl>
   </w:abstractNum>
@@ -2117,10 +2169,10 @@
     <w:name w:val="Body Text"/>
     <w:basedOn w:val="Normal"/>
     <w:link w:val="BodyTextChar"/>
-    <w:qFormat/>
     <w:pPr>
       <w:spacing w:after="180" w:before="180"/>
     </w:pPr>
+    <w:qFormat/>
   </w:style>
   <w:style w:customStyle="1" w:styleId="FirstParagraph" w:type="paragraph">
     <w:name w:val="First Paragraph"/>
@@ -2140,94 +2192,57 @@
     <w:name w:val="Title"/>
     <w:basedOn w:val="Normal"/>
     <w:next w:val="BodyText"/>
-    <w:link w:val="TitleChar"/>
-    <w:uiPriority w:val="10"/>
     <w:qFormat/>
-    <w:rsid w:val="00A10FD9"/>
     <w:pPr>
-      <w:spacing w:after="80" w:line="240" w:lineRule="auto"/>
-      <w:contextualSpacing/>
+      <w:keepNext/>
+      <w:keepLines/>
+      <w:spacing w:after="240" w:before="480"/>
       <w:jc w:val="center"/>
     </w:pPr>
     <w:rPr>
       <w:rFonts w:asciiTheme="majorHAnsi" w:cstheme="majorBidi" w:eastAsiaTheme="majorEastAsia" w:hAnsiTheme="majorHAnsi"/>
-      <w:sz w:val="56"/>
-      <w:szCs w:val="56"/>
-    </w:rPr>
-  </w:style>
-  <w:style w:customStyle="1" w:styleId="TitleChar" w:type="character">
-    <w:name w:val="Title Char"/>
-    <w:basedOn w:val="DefaultParagraphFont"/>
-    <w:link w:val="Title"/>
-    <w:uiPriority w:val="10"/>
-    <w:rsid w:val="00A10FD9"/>
-    <w:rPr>
-      <w:rFonts w:asciiTheme="majorHAnsi" w:cstheme="majorBidi" w:eastAsiaTheme="majorEastAsia" w:hAnsiTheme="majorHAnsi"/>
-      <w:sz w:val="56"/>
-      <w:szCs w:val="56"/>
+      <w:b/>
+      <w:bCs/>
+      <w:color w:themeColor="accent1" w:themeShade="B5" w:val="345A8A"/>
+      <w:sz w:val="36"/>
+      <w:szCs w:val="36"/>
     </w:rPr>
   </w:style>
   <w:style w:styleId="Subtitle" w:type="paragraph">
     <w:name w:val="Subtitle"/>
-    <w:basedOn w:val="Title"/>
-    <w:next w:val="BodyText"/>
-    <w:link w:val="SubtitleChar"/>
-    <w:uiPriority w:val="11"/>
-    <w:qFormat/>
-    <w:rsid w:val="00A10FD9"/>
-    <w:pPr>
-      <w:numPr>
-        <w:ilvl w:val="1"/>
-      </w:numPr>
-    </w:pPr>
-    <w:rPr>
-      <w:rFonts w:cstheme="majorBidi" w:eastAsiaTheme="majorEastAsia"/>
-      <w:spacing w:val="15"/>
-      <w:sz w:val="28"/>
-      <w:szCs w:val="28"/>
-    </w:rPr>
-  </w:style>
-  <w:style w:customStyle="1" w:styleId="SubtitleChar" w:type="character">
-    <w:name w:val="Subtitle Char"/>
-    <w:basedOn w:val="DefaultParagraphFont"/>
-    <w:link w:val="Subtitle"/>
-    <w:uiPriority w:val="11"/>
-    <w:rsid w:val="00A10FD9"/>
-    <w:rPr>
-      <w:rFonts w:cstheme="majorBidi" w:eastAsiaTheme="majorEastAsia"/>
-      <w:color w:themeColor="text1" w:themeTint="A6" w:val="595959"/>
-      <w:spacing w:val="15"/>
-      <w:sz w:val="28"/>
-      <w:szCs w:val="28"/>
-    </w:rPr>
-  </w:style>
-  <w:style w:customStyle="1" w:styleId="Author" w:type="paragraph">
-    <w:name w:val="Author"/>
     <w:basedOn w:val="Title"/>
     <w:next w:val="BodyText"/>
     <w:qFormat/>
     <w:pPr>
       <w:keepNext/>
       <w:keepLines/>
+      <w:spacing w:after="240" w:before="240"/>
+      <w:jc w:val="center"/>
     </w:pPr>
     <w:rPr>
-      <w:sz w:val="24"/>
-      <w:szCs w:val="24"/>
-    </w:rPr>
-  </w:style>
-  <w:style w:styleId="Date" w:type="paragraph">
-    <w:name w:val="Date"/>
-    <w:basedOn w:val="Title"/>
+      <w:sz w:val="30"/>
+      <w:szCs w:val="30"/>
+    </w:rPr>
+  </w:style>
+  <w:style w:customStyle="1" w:styleId="Author" w:type="paragraph">
+    <w:name w:val="Author"/>
     <w:next w:val="BodyText"/>
     <w:qFormat/>
     <w:pPr>
       <w:keepNext/>
       <w:keepLines/>
+      <w:jc w:val="center"/>
     </w:pPr>
-    <w:rPr>
-      <w:sz w:val="24"/>
-      <w:szCs w:val="24"/>
-    </w:rPr>
+  </w:style>
+  <w:style w:styleId="Date" w:type="paragraph">
+    <w:name w:val="Date"/>
+    <w:next w:val="BodyText"/>
+    <w:qFormat/>
+    <w:pPr>
+      <w:keepNext/>
+      <w:keepLines/>
+      <w:jc w:val="center"/>
+    </w:pPr>
   </w:style>
   <w:style w:customStyle="1" w:styleId="AbstractTitle" w:type="paragraph">
     <w:name w:val="Abstract Title"/>
@@ -2237,13 +2252,15 @@
     <w:pPr>
       <w:keepNext/>
       <w:keepLines/>
+      <w:jc w:val="center"/>
       <w:spacing w:after="0" w:before="300"/>
-      <w:jc w:val="center"/>
     </w:pPr>
     <w:rPr>
-      <w:b/>
       <w:sz w:val="20"/>
       <w:szCs w:val="20"/>
+      <w:b/>
+      <w:color w:val="345A8A"/>
+      &gt;
     </w:rPr>
   </w:style>
   <w:style w:customStyle="1" w:styleId="Abstract" w:type="paragraph">
@@ -2270,321 +2287,191 @@
     <w:rPr/>
   </w:style>
   <w:style w:styleId="Heading1" w:type="paragraph">
-    <w:name w:val="heading 1"/>
+    <w:name w:val="Heading 1"/>
     <w:basedOn w:val="Normal"/>
     <w:next w:val="BodyText"/>
-    <w:link w:val="Heading1Char"/>
     <w:uiPriority w:val="9"/>
     <w:qFormat/>
-    <w:rsid w:val="00A10FD9"/>
     <w:pPr>
       <w:keepNext/>
       <w:keepLines/>
-      <w:spacing w:after="80" w:before="360"/>
+      <w:spacing w:after="0" w:before="480"/>
       <w:outlineLvl w:val="0"/>
     </w:pPr>
     <w:rPr>
       <w:rFonts w:asciiTheme="majorHAnsi" w:cstheme="majorBidi" w:eastAsiaTheme="majorEastAsia" w:hAnsiTheme="majorHAnsi"/>
-      <w:color w:themeColor="accent1" w:themeShade="BF" w:val="0F4761"/>
-      <w:sz w:val="40"/>
-      <w:szCs w:val="40"/>
+      <w:b/>
+      <w:bCs/>
+      <w:color w:themeColor="accent1" w:val="4F81BD"/>
+      <w:sz w:val="32"/>
+      <w:szCs w:val="32"/>
     </w:rPr>
   </w:style>
   <w:style w:styleId="Heading2" w:type="paragraph">
-    <w:name w:val="heading 2"/>
+    <w:name w:val="Heading 2"/>
     <w:basedOn w:val="Normal"/>
     <w:next w:val="BodyText"/>
-    <w:link w:val="Heading2Char"/>
     <w:uiPriority w:val="9"/>
-    <w:semiHidden/>
     <w:unhideWhenUsed/>
     <w:qFormat/>
-    <w:rsid w:val="00A10FD9"/>
     <w:pPr>
       <w:keepNext/>
       <w:keepLines/>
-      <w:spacing w:after="80" w:before="160"/>
+      <w:spacing w:after="0" w:before="200"/>
       <w:outlineLvl w:val="1"/>
     </w:pPr>
     <w:rPr>
       <w:rFonts w:asciiTheme="majorHAnsi" w:cstheme="majorBidi" w:eastAsiaTheme="majorEastAsia" w:hAnsiTheme="majorHAnsi"/>
-      <w:color w:themeColor="accent1" w:themeShade="BF" w:val="0F4761"/>
-      <w:sz w:val="32"/>
-      <w:szCs w:val="32"/>
+      <w:b/>
+      <w:bCs/>
+      <w:color w:themeColor="accent1" w:val="4F81BD"/>
+      <w:sz w:val="28"/>
+      <w:szCs w:val="28"/>
     </w:rPr>
   </w:style>
   <w:style w:styleId="Heading3" w:type="paragraph">
-    <w:name w:val="heading 3"/>
+    <w:name w:val="Heading 3"/>
     <w:basedOn w:val="Normal"/>
     <w:next w:val="BodyText"/>
-    <w:link w:val="Heading3Char"/>
     <w:uiPriority w:val="9"/>
-    <w:semiHidden/>
     <w:unhideWhenUsed/>
     <w:qFormat/>
-    <w:rsid w:val="00A10FD9"/>
     <w:pPr>
       <w:keepNext/>
       <w:keepLines/>
-      <w:spacing w:after="80" w:before="160"/>
+      <w:spacing w:after="0" w:before="200"/>
       <w:outlineLvl w:val="2"/>
     </w:pPr>
     <w:rPr>
-      <w:rFonts w:cstheme="majorBidi" w:eastAsiaTheme="majorEastAsia"/>
-      <w:color w:themeColor="accent1" w:themeShade="BF" w:val="0F4761"/>
-      <w:sz w:val="28"/>
-      <w:szCs w:val="28"/>
+      <w:rFonts w:asciiTheme="majorHAnsi" w:cstheme="majorBidi" w:eastAsiaTheme="majorEastAsia" w:hAnsiTheme="majorHAnsi"/>
+      <w:b/>
+      <w:bCs/>
+      <w:color w:themeColor="accent1" w:val="4F81BD"/>
+      <w:sz w:val="24"/>
+      <w:szCs w:val="24"/>
     </w:rPr>
   </w:style>
   <w:style w:styleId="Heading4" w:type="paragraph">
-    <w:name w:val="heading 4"/>
+    <w:name w:val="Heading 4"/>
     <w:basedOn w:val="Normal"/>
     <w:next w:val="BodyText"/>
-    <w:link w:val="Heading4Char"/>
     <w:uiPriority w:val="9"/>
-    <w:semiHidden/>
     <w:unhideWhenUsed/>
     <w:qFormat/>
-    <w:rsid w:val="00A10FD9"/>
     <w:pPr>
       <w:keepNext/>
       <w:keepLines/>
-      <w:spacing w:after="40" w:before="80"/>
+      <w:spacing w:after="0" w:before="200"/>
       <w:outlineLvl w:val="3"/>
     </w:pPr>
     <w:rPr>
-      <w:rFonts w:cstheme="majorBidi" w:eastAsiaTheme="majorEastAsia"/>
+      <w:rFonts w:asciiTheme="majorHAnsi" w:cstheme="majorBidi" w:eastAsiaTheme="majorEastAsia" w:hAnsiTheme="majorHAnsi"/>
       <w:i/>
-      <w:iCs/>
-      <w:color w:themeColor="accent1" w:themeShade="BF" w:val="0F4761"/>
+      <w:bCs/>
+      <w:color w:themeColor="accent1" w:val="4F81BD"/>
+      <w:sz w:val="24"/>
+      <w:szCs w:val="24"/>
     </w:rPr>
   </w:style>
   <w:style w:styleId="Heading5" w:type="paragraph">
-    <w:name w:val="heading 5"/>
+    <w:name w:val="Heading 5"/>
     <w:basedOn w:val="Normal"/>
     <w:next w:val="BodyText"/>
-    <w:link w:val="Heading5Char"/>
     <w:uiPriority w:val="9"/>
-    <w:semiHidden/>
     <w:unhideWhenUsed/>
     <w:qFormat/>
-    <w:rsid w:val="00A10FD9"/>
     <w:pPr>
       <w:keepNext/>
       <w:keepLines/>
-      <w:spacing w:after="40" w:before="80"/>
+      <w:spacing w:after="0" w:before="200"/>
       <w:outlineLvl w:val="4"/>
     </w:pPr>
     <w:rPr>
-      <w:rFonts w:cstheme="majorBidi" w:eastAsiaTheme="majorEastAsia"/>
-      <w:color w:themeColor="accent1" w:themeShade="BF" w:val="0F4761"/>
+      <w:rFonts w:asciiTheme="majorHAnsi" w:cstheme="majorBidi" w:eastAsiaTheme="majorEastAsia" w:hAnsiTheme="majorHAnsi"/>
+      <w:iCs/>
+      <w:color w:themeColor="accent1" w:val="4F81BD"/>
+      <w:sz w:val="24"/>
+      <w:szCs w:val="24"/>
     </w:rPr>
   </w:style>
   <w:style w:styleId="Heading6" w:type="paragraph">
-    <w:name w:val="heading 6"/>
+    <w:name w:val="Heading 6"/>
     <w:basedOn w:val="Normal"/>
     <w:next w:val="BodyText"/>
-    <w:link w:val="Heading6Char"/>
     <w:uiPriority w:val="9"/>
-    <w:semiHidden/>
     <w:unhideWhenUsed/>
     <w:qFormat/>
-    <w:rsid w:val="00A10FD9"/>
     <w:pPr>
       <w:keepNext/>
       <w:keepLines/>
-      <w:spacing w:after="0" w:before="40"/>
+      <w:spacing w:after="0" w:before="200"/>
       <w:outlineLvl w:val="5"/>
     </w:pPr>
     <w:rPr>
-      <w:rFonts w:cstheme="majorBidi" w:eastAsiaTheme="majorEastAsia"/>
-      <w:i/>
-      <w:iCs/>
-      <w:color w:themeColor="text1" w:themeTint="A6" w:val="595959"/>
+      <w:rFonts w:asciiTheme="majorHAnsi" w:cstheme="majorBidi" w:eastAsiaTheme="majorEastAsia" w:hAnsiTheme="majorHAnsi"/>
+      <w:color w:themeColor="accent1" w:val="4F81BD"/>
+      <w:sz w:val="24"/>
+      <w:szCs w:val="24"/>
     </w:rPr>
   </w:style>
   <w:style w:styleId="Heading7" w:type="paragraph">
-    <w:name w:val="heading 7"/>
+    <w:name w:val="Heading 7"/>
     <w:basedOn w:val="Normal"/>
     <w:next w:val="BodyText"/>
-    <w:link w:val="Heading7Char"/>
     <w:uiPriority w:val="9"/>
-    <w:semiHidden/>
     <w:unhideWhenUsed/>
     <w:qFormat/>
-    <w:rsid w:val="00A10FD9"/>
     <w:pPr>
       <w:keepNext/>
       <w:keepLines/>
-      <w:spacing w:after="0" w:before="40"/>
+      <w:spacing w:after="0" w:before="200"/>
       <w:outlineLvl w:val="6"/>
     </w:pPr>
     <w:rPr>
-      <w:rFonts w:cstheme="majorBidi" w:eastAsiaTheme="majorEastAsia"/>
-      <w:color w:themeColor="text1" w:themeTint="A6" w:val="595959"/>
+      <w:rFonts w:asciiTheme="majorHAnsi" w:cstheme="majorBidi" w:eastAsiaTheme="majorEastAsia" w:hAnsiTheme="majorHAnsi"/>
+      <w:color w:themeColor="accent1" w:val="4F81BD"/>
+      <w:sz w:val="24"/>
+      <w:szCs w:val="24"/>
     </w:rPr>
   </w:style>
   <w:style w:styleId="Heading8" w:type="paragraph">
-    <w:name w:val="heading 8"/>
+    <w:name w:val="Heading 8"/>
     <w:basedOn w:val="Normal"/>
     <w:next w:val="BodyText"/>
-    <w:link w:val="Heading8Char"/>
     <w:uiPriority w:val="9"/>
-    <w:semiHidden/>
     <w:unhideWhenUsed/>
     <w:qFormat/>
-    <w:rsid w:val="00A10FD9"/>
     <w:pPr>
       <w:keepNext/>
       <w:keepLines/>
-      <w:spacing w:after="0"/>
+      <w:spacing w:after="0" w:before="200"/>
       <w:outlineLvl w:val="7"/>
     </w:pPr>
     <w:rPr>
-      <w:rFonts w:cstheme="majorBidi" w:eastAsiaTheme="majorEastAsia"/>
-      <w:i/>
-      <w:iCs/>
-      <w:color w:themeColor="text1" w:themeTint="D8" w:val="272727"/>
+      <w:rFonts w:asciiTheme="majorHAnsi" w:cstheme="majorBidi" w:eastAsiaTheme="majorEastAsia" w:hAnsiTheme="majorHAnsi"/>
+      <w:color w:themeColor="accent1" w:val="4F81BD"/>
+      <w:sz w:val="24"/>
+      <w:szCs w:val="24"/>
     </w:rPr>
   </w:style>
   <w:style w:styleId="Heading9" w:type="paragraph">
-    <w:name w:val="heading 9"/>
+    <w:name w:val="Heading 9"/>
     <w:basedOn w:val="Normal"/>
     <w:next w:val="BodyText"/>
-    <w:link w:val="Heading9Char"/>
     <w:uiPriority w:val="9"/>
-    <w:semiHidden/>
     <w:unhideWhenUsed/>
     <w:qFormat/>
-    <w:rsid w:val="00A10FD9"/>
     <w:pPr>
       <w:keepNext/>
       <w:keepLines/>
-      <w:spacing w:after="0"/>
+      <w:spacing w:after="0" w:before="200"/>
       <w:outlineLvl w:val="8"/>
     </w:pPr>
     <w:rPr>
-      <w:rFonts w:cstheme="majorBidi" w:eastAsiaTheme="majorEastAsia"/>
-      <w:color w:themeColor="text1" w:themeTint="D8" w:val="272727"/>
-    </w:rPr>
-  </w:style>
-  <w:style w:customStyle="1" w:styleId="Heading1Char" w:type="character">
-    <w:name w:val="Heading 1 Char"/>
-    <w:basedOn w:val="DefaultParagraphFont"/>
-    <w:link w:val="Heading1"/>
-    <w:uiPriority w:val="9"/>
-    <w:rsid w:val="00A10FD9"/>
-    <w:rPr>
       <w:rFonts w:asciiTheme="majorHAnsi" w:cstheme="majorBidi" w:eastAsiaTheme="majorEastAsia" w:hAnsiTheme="majorHAnsi"/>
-      <w:color w:themeColor="accent1" w:themeShade="BF" w:val="0F4761"/>
-      <w:sz w:val="40"/>
-      <w:szCs w:val="40"/>
-    </w:rPr>
-  </w:style>
-  <w:style w:customStyle="1" w:styleId="Heading2Char" w:type="character">
-    <w:name w:val="Heading 2 Char"/>
-    <w:basedOn w:val="DefaultParagraphFont"/>
-    <w:link w:val="Heading2"/>
-    <w:uiPriority w:val="9"/>
-    <w:semiHidden/>
-    <w:rsid w:val="00A10FD9"/>
-    <w:rPr>
-      <w:rFonts w:asciiTheme="majorHAnsi" w:cstheme="majorBidi" w:eastAsiaTheme="majorEastAsia" w:hAnsiTheme="majorHAnsi"/>
-      <w:color w:themeColor="accent1" w:themeShade="BF" w:val="0F4761"/>
-      <w:sz w:val="32"/>
-      <w:szCs w:val="32"/>
-    </w:rPr>
-  </w:style>
-  <w:style w:customStyle="1" w:styleId="Heading3Char" w:type="character">
-    <w:name w:val="Heading 3 Char"/>
-    <w:basedOn w:val="DefaultParagraphFont"/>
-    <w:link w:val="Heading3"/>
-    <w:uiPriority w:val="9"/>
-    <w:semiHidden/>
-    <w:rsid w:val="00A10FD9"/>
-    <w:rPr>
-      <w:rFonts w:cstheme="majorBidi" w:eastAsiaTheme="majorEastAsia"/>
-      <w:color w:themeColor="accent1" w:themeShade="BF" w:val="0F4761"/>
-      <w:sz w:val="28"/>
-      <w:szCs w:val="28"/>
-    </w:rPr>
-  </w:style>
-  <w:style w:customStyle="1" w:styleId="Heading4Char" w:type="character">
-    <w:name w:val="Heading 4 Char"/>
-    <w:basedOn w:val="DefaultParagraphFont"/>
-    <w:link w:val="Heading4"/>
-    <w:uiPriority w:val="9"/>
-    <w:semiHidden/>
-    <w:rsid w:val="00A10FD9"/>
-    <w:rPr>
-      <w:rFonts w:cstheme="majorBidi" w:eastAsiaTheme="majorEastAsia"/>
-      <w:i/>
-      <w:iCs/>
-      <w:color w:themeColor="accent1" w:themeShade="BF" w:val="0F4761"/>
-    </w:rPr>
-  </w:style>
-  <w:style w:customStyle="1" w:styleId="Heading5Char" w:type="character">
-    <w:name w:val="Heading 5 Char"/>
-    <w:basedOn w:val="DefaultParagraphFont"/>
-    <w:link w:val="Heading5"/>
-    <w:uiPriority w:val="9"/>
-    <w:semiHidden/>
-    <w:rsid w:val="00A10FD9"/>
-    <w:rPr>
-      <w:rFonts w:cstheme="majorBidi" w:eastAsiaTheme="majorEastAsia"/>
-      <w:color w:themeColor="accent1" w:themeShade="BF" w:val="0F4761"/>
-    </w:rPr>
-  </w:style>
-  <w:style w:customStyle="1" w:styleId="Heading6Char" w:type="character">
-    <w:name w:val="Heading 6 Char"/>
-    <w:basedOn w:val="DefaultParagraphFont"/>
-    <w:link w:val="Heading6"/>
-    <w:uiPriority w:val="9"/>
-    <w:semiHidden/>
-    <w:rsid w:val="00A10FD9"/>
-    <w:rPr>
-      <w:rFonts w:cstheme="majorBidi" w:eastAsiaTheme="majorEastAsia"/>
-      <w:i/>
-      <w:iCs/>
-      <w:color w:themeColor="text1" w:themeTint="A6" w:val="595959"/>
-    </w:rPr>
-  </w:style>
-  <w:style w:customStyle="1" w:styleId="Heading7Char" w:type="character">
-    <w:name w:val="Heading 7 Char"/>
-    <w:basedOn w:val="DefaultParagraphFont"/>
-    <w:link w:val="Heading7"/>
-    <w:uiPriority w:val="9"/>
-    <w:semiHidden/>
-    <w:rsid w:val="00A10FD9"/>
-    <w:rPr>
-      <w:rFonts w:cstheme="majorBidi" w:eastAsiaTheme="majorEastAsia"/>
-      <w:color w:themeColor="text1" w:themeTint="A6" w:val="595959"/>
-    </w:rPr>
-  </w:style>
-  <w:style w:customStyle="1" w:styleId="Heading8Char" w:type="character">
-    <w:name w:val="Heading 8 Char"/>
-    <w:basedOn w:val="DefaultParagraphFont"/>
-    <w:link w:val="Heading8"/>
-    <w:uiPriority w:val="9"/>
-    <w:semiHidden/>
-    <w:rsid w:val="00A10FD9"/>
-    <w:rPr>
-      <w:rFonts w:cstheme="majorBidi" w:eastAsiaTheme="majorEastAsia"/>
-      <w:i/>
-      <w:iCs/>
-      <w:color w:themeColor="text1" w:themeTint="D8" w:val="272727"/>
-    </w:rPr>
-  </w:style>
-  <w:style w:customStyle="1" w:styleId="Heading9Char" w:type="character">
-    <w:name w:val="Heading 9 Char"/>
-    <w:basedOn w:val="DefaultParagraphFont"/>
-    <w:link w:val="Heading9"/>
-    <w:uiPriority w:val="9"/>
-    <w:semiHidden/>
-    <w:rsid w:val="00A10FD9"/>
-    <w:rPr>
-      <w:rFonts w:cstheme="majorBidi" w:eastAsiaTheme="majorEastAsia"/>
-      <w:color w:themeColor="text1" w:themeTint="D8" w:val="272727"/>
+      <w:color w:themeColor="accent1" w:val="4F81BD"/>
+      <w:sz w:val="24"/>
+      <w:szCs w:val="24"/>
     </w:rPr>
   </w:style>
   <w:style w:styleId="BlockText" w:type="paragraph">
@@ -2606,18 +2493,6 @@
     <w:uiPriority w:val="9"/>
     <w:unhideWhenUsed/>
     <w:qFormat/>
-  </w:style>
-  <w:style w:styleId="FootnoteBlockText" w:type="paragraph">
-    <w:name w:val="Footnote Block Text"/>
-    <w:basedOn w:val="FootnoteText"/>
-    <w:next w:val="FootnoteText"/>
-    <w:uiPriority w:val="9"/>
-    <w:unhideWhenUsed/>
-    <w:qFormat/>
-    <w:pPr>
-      <w:spacing w:after="100" w:before="100"/>
-      <w:ind w:firstLine="0" w:left="480" w:right="480"/>
-    </w:pPr>
   </w:style>
   <w:style w:default="1" w:styleId="DefaultParagraphFont" w:type="character">
     <w:name w:val="Default Paragraph Font"/>
@@ -2648,10 +2523,10 @@
         <w:jc w:val="left"/>
       </w:trPr>
       <w:tcPr>
+        <w:vAlign w:val="bottom"/>
         <w:tcBorders>
           <w:bottom w:val="single"/>
         </w:tcBorders>
-        <w:vAlign w:val="bottom"/>
       </w:tcPr>
     </w:tblStylePr>
   </w:style>
@@ -2767,9 +2642,9 @@
     <w:name w:val="KeywordTok"/>
     <w:basedOn w:val="VerbatimChar"/>
     <w:rPr>
-      <w:b/>
       <w:color w:val="204a87"/>
       <w:shd w:val="clear" w:fill="f8f8f8"/>
+      <w:b/>
     </w:rPr>
   </w:style>
   <w:style w:type="character" w:customStyle="1" w:styleId="DataTypeTok">
@@ -2824,9 +2699,9 @@
     <w:name w:val="SpecialCharTok"/>
     <w:basedOn w:val="VerbatimChar"/>
     <w:rPr>
-      <w:b/>
       <w:color w:val="ce5c00"/>
       <w:shd w:val="clear" w:fill="f8f8f8"/>
+      <w:b/>
     </w:rPr>
   </w:style>
   <w:style w:type="character" w:customStyle="1" w:styleId="StringTok">
@@ -2864,39 +2739,39 @@
     <w:name w:val="CommentTok"/>
     <w:basedOn w:val="VerbatimChar"/>
     <w:rPr>
-      <w:i/>
       <w:color w:val="8f5902"/>
       <w:shd w:val="clear" w:fill="f8f8f8"/>
+      <w:i/>
     </w:rPr>
   </w:style>
   <w:style w:type="character" w:customStyle="1" w:styleId="DocumentationTok">
     <w:name w:val="DocumentationTok"/>
     <w:basedOn w:val="VerbatimChar"/>
     <w:rPr>
+      <w:color w:val="8f5902"/>
+      <w:shd w:val="clear" w:fill="f8f8f8"/>
       <w:b/>
       <w:i/>
-      <w:color w:val="8f5902"/>
-      <w:shd w:val="clear" w:fill="f8f8f8"/>
     </w:rPr>
   </w:style>
   <w:style w:type="character" w:customStyle="1" w:styleId="AnnotationTok">
     <w:name w:val="AnnotationTok"/>
     <w:basedOn w:val="VerbatimChar"/>
     <w:rPr>
+      <w:color w:val="8f5902"/>
+      <w:shd w:val="clear" w:fill="f8f8f8"/>
       <w:b/>
       <w:i/>
-      <w:color w:val="8f5902"/>
-      <w:shd w:val="clear" w:fill="f8f8f8"/>
     </w:rPr>
   </w:style>
   <w:style w:type="character" w:customStyle="1" w:styleId="CommentVarTok">
     <w:name w:val="CommentVarTok"/>
     <w:basedOn w:val="VerbatimChar"/>
     <w:rPr>
+      <w:color w:val="8f5902"/>
+      <w:shd w:val="clear" w:fill="f8f8f8"/>
       <w:b/>
       <w:i/>
-      <w:color w:val="8f5902"/>
-      <w:shd w:val="clear" w:fill="f8f8f8"/>
     </w:rPr>
   </w:style>
   <w:style w:type="character" w:customStyle="1" w:styleId="OtherTok">
@@ -2911,9 +2786,9 @@
     <w:name w:val="FunctionTok"/>
     <w:basedOn w:val="VerbatimChar"/>
     <w:rPr>
-      <w:b/>
       <w:color w:val="204a87"/>
       <w:shd w:val="clear" w:fill="f8f8f8"/>
+      <w:b/>
     </w:rPr>
   </w:style>
   <w:style w:type="character" w:customStyle="1" w:styleId="VariableTok">
@@ -2928,18 +2803,18 @@
     <w:name w:val="ControlFlowTok"/>
     <w:basedOn w:val="VerbatimChar"/>
     <w:rPr>
-      <w:b/>
       <w:color w:val="204a87"/>
       <w:shd w:val="clear" w:fill="f8f8f8"/>
+      <w:b/>
     </w:rPr>
   </w:style>
   <w:style w:type="character" w:customStyle="1" w:styleId="OperatorTok">
     <w:name w:val="OperatorTok"/>
     <w:basedOn w:val="VerbatimChar"/>
     <w:rPr>
-      <w:b/>
       <w:color w:val="ce5c00"/>
       <w:shd w:val="clear" w:fill="f8f8f8"/>
+      <w:b/>
     </w:rPr>
   </w:style>
   <w:style w:type="character" w:customStyle="1" w:styleId="BuiltInTok">
@@ -2960,9 +2835,9 @@
     <w:name w:val="PreprocessorTok"/>
     <w:basedOn w:val="VerbatimChar"/>
     <w:rPr>
-      <w:i/>
       <w:color w:val="8f5902"/>
       <w:shd w:val="clear" w:fill="f8f8f8"/>
+      <w:i/>
     </w:rPr>
   </w:style>
   <w:style w:type="character" w:customStyle="1" w:styleId="AttributeTok">
@@ -2984,20 +2859,20 @@
     <w:name w:val="InformationTok"/>
     <w:basedOn w:val="VerbatimChar"/>
     <w:rPr>
+      <w:color w:val="8f5902"/>
+      <w:shd w:val="clear" w:fill="f8f8f8"/>
       <w:b/>
       <w:i/>
-      <w:color w:val="8f5902"/>
-      <w:shd w:val="clear" w:fill="f8f8f8"/>
     </w:rPr>
   </w:style>
   <w:style w:type="character" w:customStyle="1" w:styleId="WarningTok">
     <w:name w:val="WarningTok"/>
     <w:basedOn w:val="VerbatimChar"/>
     <w:rPr>
+      <w:color w:val="8f5902"/>
+      <w:shd w:val="clear" w:fill="f8f8f8"/>
       <w:b/>
       <w:i/>
-      <w:color w:val="8f5902"/>
-      <w:shd w:val="clear" w:fill="f8f8f8"/>
     </w:rPr>
   </w:style>
   <w:style w:type="character" w:customStyle="1" w:styleId="AlertTok">
@@ -3012,9 +2887,9 @@
     <w:name w:val="ErrorTok"/>
     <w:basedOn w:val="VerbatimChar"/>
     <w:rPr>
-      <w:b/>
       <w:color w:val="a40000"/>
       <w:shd w:val="clear" w:fill="f8f8f8"/>
+      <w:b/>
     </w:rPr>
   </w:style>
   <w:style w:type="character" w:customStyle="1" w:styleId="NormalTok">
@@ -3038,44 +2913,44 @@
         <a:sysClr val="window" lastClr="FFFFFF"/>
       </a:lt1>
       <a:dk2>
-        <a:srgbClr val="0E2841"/>
+        <a:srgbClr val="1F497D"/>
       </a:dk2>
       <a:lt2>
-        <a:srgbClr val="E8E8E8"/>
+        <a:srgbClr val="EEECE1"/>
       </a:lt2>
       <a:accent1>
-        <a:srgbClr val="156082"/>
+        <a:srgbClr val="4F81BD"/>
       </a:accent1>
       <a:accent2>
-        <a:srgbClr val="E97132"/>
+        <a:srgbClr val="C0504D"/>
       </a:accent2>
       <a:accent3>
-        <a:srgbClr val="196B24"/>
+        <a:srgbClr val="9BBB59"/>
       </a:accent3>
       <a:accent4>
-        <a:srgbClr val="0F9ED5"/>
+        <a:srgbClr val="8064A2"/>
       </a:accent4>
       <a:accent5>
-        <a:srgbClr val="A02B93"/>
+        <a:srgbClr val="4BACC6"/>
       </a:accent5>
       <a:accent6>
-        <a:srgbClr val="4EA72E"/>
+        <a:srgbClr val="F79646"/>
       </a:accent6>
       <a:hlink>
-        <a:srgbClr val="467886"/>
+        <a:srgbClr val="0000FF"/>
       </a:hlink>
       <a:folHlink>
-        <a:srgbClr val="96607D"/>
+        <a:srgbClr val="800080"/>
       </a:folHlink>
     </a:clrScheme>
     <a:fontScheme name="Office">
       <a:majorFont>
-        <a:latin typeface="Aptos Display" panose="02110004020202020204"/>
+        <a:latin typeface="Calibri"/>
         <a:ea typeface=""/>
         <a:cs typeface=""/>
-        <a:font script="Jpan" typeface="游ゴシック Light"/>
+        <a:font script="Jpan" typeface="ＭＳ ゴシック"/>
         <a:font script="Hang" typeface="맑은 고딕"/>
-        <a:font script="Hans" typeface="等线 Light"/>
+        <a:font script="Hans" typeface="宋体"/>
         <a:font script="Hant" typeface="新細明體"/>
         <a:font script="Arab" typeface="Times New Roman"/>
         <a:font script="Hebr" typeface="Times New Roman"/>
@@ -3102,32 +2977,14 @@
         <a:font script="Mong" typeface="Mongolian Baiti"/>
         <a:font script="Viet" typeface="Times New Roman"/>
         <a:font script="Uigh" typeface="Microsoft Uighur"/>
-        <a:font script="Geor" typeface="Sylfaen"/>
-        <a:font script="Armn" typeface="Arial"/>
-        <a:font script="Bugi" typeface="Leelawadee UI"/>
-        <a:font script="Bopo" typeface="Microsoft JhengHei"/>
-        <a:font script="Java" typeface="Javanese Text"/>
-        <a:font script="Lisu" typeface="Segoe UI"/>
-        <a:font script="Mymr" typeface="Myanmar Text"/>
-        <a:font script="Nkoo" typeface="Ebrima"/>
-        <a:font script="Olck" typeface="Nirmala UI"/>
-        <a:font script="Osma" typeface="Ebrima"/>
-        <a:font script="Phag" typeface="Phagspa"/>
-        <a:font script="Syrn" typeface="Estrangelo Edessa"/>
-        <a:font script="Syrj" typeface="Estrangelo Edessa"/>
-        <a:font script="Syre" typeface="Estrangelo Edessa"/>
-        <a:font script="Sora" typeface="Nirmala UI"/>
-        <a:font script="Tale" typeface="Microsoft Tai Le"/>
-        <a:font script="Talu" typeface="Microsoft New Tai Lue"/>
-        <a:font script="Tfng" typeface="Ebrima"/>
       </a:majorFont>
       <a:minorFont>
-        <a:latin typeface="Aptos" panose="02110004020202020204"/>
+        <a:latin typeface="Cambria"/>
         <a:ea typeface=""/>
         <a:cs typeface=""/>
-        <a:font script="Jpan" typeface="游明朝"/>
+        <a:font script="Jpan" typeface="ＭＳ 明朝"/>
         <a:font script="Hang" typeface="맑은 고딕"/>
-        <a:font script="Hans" typeface="等线"/>
+        <a:font script="Hans" typeface="宋体"/>
         <a:font script="Hant" typeface="新細明體"/>
         <a:font script="Arab" typeface="Arial"/>
         <a:font script="Hebr" typeface="Arial"/>
@@ -3154,24 +3011,6 @@
         <a:font script="Mong" typeface="Mongolian Baiti"/>
         <a:font script="Viet" typeface="Arial"/>
         <a:font script="Uigh" typeface="Microsoft Uighur"/>
-        <a:font script="Geor" typeface="Sylfaen"/>
-        <a:font script="Armn" typeface="Arial"/>
-        <a:font script="Bugi" typeface="Leelawadee UI"/>
-        <a:font script="Bopo" typeface="Microsoft JhengHei"/>
-        <a:font script="Java" typeface="Javanese Text"/>
-        <a:font script="Lisu" typeface="Segoe UI"/>
-        <a:font script="Mymr" typeface="Myanmar Text"/>
-        <a:font script="Nkoo" typeface="Ebrima"/>
-        <a:font script="Olck" typeface="Nirmala UI"/>
-        <a:font script="Osma" typeface="Ebrima"/>
-        <a:font script="Phag" typeface="Phagspa"/>
-        <a:font script="Syrn" typeface="Estrangelo Edessa"/>
-        <a:font script="Syrj" typeface="Estrangelo Edessa"/>
-        <a:font script="Syre" typeface="Estrangelo Edessa"/>
-        <a:font script="Sora" typeface="Nirmala UI"/>
-        <a:font script="Tale" typeface="Microsoft Tai Le"/>
-        <a:font script="Talu" typeface="Microsoft New Tai Lue"/>
-        <a:font script="Tfng" typeface="Ebrima"/>
       </a:minorFont>
     </a:fontScheme>
     <a:fmtScheme name="Office">
@@ -3183,141 +3022,200 @@
           <a:gsLst>
             <a:gs pos="0">
               <a:schemeClr val="phClr">
-                <a:lumMod val="110000"/>
-                <a:satMod val="105000"/>
-                <a:tint val="67000"/>
+                <a:tint val="50000"/>
+                <a:satMod val="300000"/>
               </a:schemeClr>
             </a:gs>
-            <a:gs pos="50000">
+            <a:gs pos="35000">
               <a:schemeClr val="phClr">
-                <a:lumMod val="105000"/>
-                <a:satMod val="103000"/>
-                <a:tint val="73000"/>
+                <a:tint val="37000"/>
+                <a:satMod val="300000"/>
               </a:schemeClr>
             </a:gs>
             <a:gs pos="100000">
               <a:schemeClr val="phClr">
-                <a:lumMod val="105000"/>
-                <a:satMod val="109000"/>
-                <a:tint val="81000"/>
+                <a:tint val="15000"/>
+                <a:satMod val="350000"/>
               </a:schemeClr>
             </a:gs>
           </a:gsLst>
-          <a:lin ang="5400000" scaled="0"/>
+          <a:lin ang="16200000" scaled="1"/>
         </a:gradFill>
         <a:gradFill rotWithShape="1">
           <a:gsLst>
             <a:gs pos="0">
               <a:schemeClr val="phClr">
-                <a:satMod val="103000"/>
-                <a:lumMod val="102000"/>
-                <a:tint val="94000"/>
-              </a:schemeClr>
-            </a:gs>
-            <a:gs pos="50000">
-              <a:schemeClr val="phClr">
-                <a:satMod val="110000"/>
-                <a:lumMod val="100000"/>
+                <a:tint val="100000"/>
                 <a:shade val="100000"/>
+                <a:satMod val="130000"/>
               </a:schemeClr>
             </a:gs>
             <a:gs pos="100000">
               <a:schemeClr val="phClr">
-                <a:lumMod val="99000"/>
-                <a:satMod val="120000"/>
-                <a:shade val="78000"/>
+                <a:tint val="50000"/>
+                <a:shade val="100000"/>
+                <a:satMod val="350000"/>
               </a:schemeClr>
             </a:gs>
           </a:gsLst>
-          <a:lin ang="5400000" scaled="0"/>
+          <a:lin ang="16200000" scaled="0"/>
         </a:gradFill>
       </a:fillStyleLst>
       <a:lnStyleLst>
-        <a:ln w="6350" cap="flat" cmpd="sng" algn="ctr">
+        <a:ln w="9525" cap="flat" cmpd="sng" algn="ctr">
+          <a:solidFill>
+            <a:schemeClr val="phClr">
+              <a:shade val="95000"/>
+              <a:satMod val="105000"/>
+            </a:schemeClr>
+          </a:solidFill>
+          <a:prstDash val="solid"/>
+        </a:ln>
+        <a:ln w="25400" cap="flat" cmpd="sng" algn="ctr">
           <a:solidFill>
             <a:schemeClr val="phClr"/>
           </a:solidFill>
           <a:prstDash val="solid"/>
-          <a:miter lim="800000"/>
         </a:ln>
-        <a:ln w="12700" cap="flat" cmpd="sng" algn="ctr">
+        <a:ln w="38100" cap="flat" cmpd="sng" algn="ctr">
           <a:solidFill>
             <a:schemeClr val="phClr"/>
           </a:solidFill>
           <a:prstDash val="solid"/>
-          <a:miter lim="800000"/>
-        </a:ln>
-        <a:ln w="19050" cap="flat" cmpd="sng" algn="ctr">
-          <a:solidFill>
-            <a:schemeClr val="phClr"/>
-          </a:solidFill>
-          <a:prstDash val="solid"/>
-          <a:miter lim="800000"/>
         </a:ln>
       </a:lnStyleLst>
       <a:effectStyleLst>
         <a:effectStyle>
-          <a:effectLst/>
-        </a:effectStyle>
-        <a:effectStyle>
-          <a:effectLst/>
+          <a:effectLst>
+            <a:outerShdw blurRad="40000" dist="20000" dir="5400000" rotWithShape="0">
+              <a:srgbClr val="000000">
+                <a:alpha val="38000"/>
+              </a:srgbClr>
+            </a:outerShdw>
+          </a:effectLst>
         </a:effectStyle>
         <a:effectStyle>
           <a:effectLst>
-            <a:outerShdw blurRad="57150" dist="19050" dir="5400000" algn="ctr" rotWithShape="0">
+            <a:outerShdw blurRad="40000" dist="23000" dir="5400000" rotWithShape="0">
               <a:srgbClr val="000000">
-                <a:alpha val="63000"/>
+                <a:alpha val="35000"/>
               </a:srgbClr>
             </a:outerShdw>
           </a:effectLst>
+        </a:effectStyle>
+        <a:effectStyle>
+          <a:effectLst>
+            <a:outerShdw blurRad="40000" dist="23000" dir="5400000" rotWithShape="0">
+              <a:srgbClr val="000000">
+                <a:alpha val="35000"/>
+              </a:srgbClr>
+            </a:outerShdw>
+          </a:effectLst>
+          <a:scene3d>
+            <a:camera prst="orthographicFront">
+              <a:rot lat="0" lon="0" rev="0"/>
+            </a:camera>
+            <a:lightRig rig="threePt" dir="t">
+              <a:rot lat="0" lon="0" rev="1200000"/>
+            </a:lightRig>
+          </a:scene3d>
+          <a:sp3d>
+            <a:bevelT w="63500" h="25400"/>
+          </a:sp3d>
         </a:effectStyle>
       </a:effectStyleLst>
       <a:bgFillStyleLst>
         <a:solidFill>
           <a:schemeClr val="phClr"/>
         </a:solidFill>
-        <a:solidFill>
-          <a:schemeClr val="phClr">
-            <a:tint val="95000"/>
-            <a:satMod val="170000"/>
-          </a:schemeClr>
-        </a:solidFill>
         <a:gradFill rotWithShape="1">
           <a:gsLst>
             <a:gs pos="0">
               <a:schemeClr val="phClr">
-                <a:tint val="93000"/>
-                <a:satMod val="150000"/>
-                <a:shade val="98000"/>
-                <a:lumMod val="102000"/>
+                <a:tint val="40000"/>
+                <a:satMod val="350000"/>
               </a:schemeClr>
             </a:gs>
-            <a:gs pos="50000">
+            <a:gs pos="40000">
               <a:schemeClr val="phClr">
-                <a:tint val="98000"/>
-                <a:satMod val="130000"/>
-                <a:shade val="90000"/>
-                <a:lumMod val="103000"/>
+                <a:tint val="45000"/>
+                <a:shade val="99000"/>
+                <a:satMod val="350000"/>
               </a:schemeClr>
             </a:gs>
             <a:gs pos="100000">
               <a:schemeClr val="phClr">
-                <a:shade val="63000"/>
-                <a:satMod val="120000"/>
+                <a:shade val="20000"/>
+                <a:satMod val="255000"/>
               </a:schemeClr>
             </a:gs>
           </a:gsLst>
-          <a:lin ang="5400000" scaled="0"/>
+          <a:path path="circle">
+            <a:fillToRect l="50000" t="-80000" r="50000" b="180000"/>
+          </a:path>
+        </a:gradFill>
+        <a:gradFill rotWithShape="1">
+          <a:gsLst>
+            <a:gs pos="0">
+              <a:schemeClr val="phClr">
+                <a:tint val="80000"/>
+                <a:satMod val="300000"/>
+              </a:schemeClr>
+            </a:gs>
+            <a:gs pos="100000">
+              <a:schemeClr val="phClr">
+                <a:shade val="30000"/>
+                <a:satMod val="200000"/>
+              </a:schemeClr>
+            </a:gs>
+          </a:gsLst>
+          <a:path path="circle">
+            <a:fillToRect l="50000" t="50000" r="50000" b="50000"/>
+          </a:path>
         </a:gradFill>
       </a:bgFillStyleLst>
     </a:fmtScheme>
   </a:themeElements>
-  <a:objectDefaults/>
+  <a:objectDefaults>
+    <a:spDef>
+      <a:spPr/>
+      <a:bodyPr/>
+      <a:lstStyle/>
+      <a:style>
+        <a:lnRef idx="1">
+          <a:schemeClr val="accent1"/>
+        </a:lnRef>
+        <a:fillRef idx="3">
+          <a:schemeClr val="accent1"/>
+        </a:fillRef>
+        <a:effectRef idx="2">
+          <a:schemeClr val="accent1"/>
+        </a:effectRef>
+        <a:fontRef idx="minor">
+          <a:schemeClr val="lt1"/>
+        </a:fontRef>
+      </a:style>
+    </a:spDef>
+    <a:lnDef>
+      <a:spPr/>
+      <a:bodyPr/>
+      <a:lstStyle/>
+      <a:style>
+        <a:lnRef idx="2">
+          <a:schemeClr val="accent1"/>
+        </a:lnRef>
+        <a:fillRef idx="0">
+          <a:schemeClr val="accent1"/>
+        </a:fillRef>
+        <a:effectRef idx="1">
+          <a:schemeClr val="accent1"/>
+        </a:effectRef>
+        <a:fontRef idx="minor">
+          <a:schemeClr val="tx1"/>
+        </a:fontRef>
+      </a:style>
+    </a:lnDef>
+  </a:objectDefaults>
   <a:extraClrSchemeLst/>
-  <a:extLst>
-    <a:ext uri="{05A4C25C-085E-4340-85A3-A5531E510DB2}">
-      <thm15:themeFamily xmlns:thm15="http://schemas.microsoft.com/office/thememl/2012/main" name="Office Theme" id="{2E142A2C-CD16-42D6-873A-C26D2A0506FA}" vid="{1BDDFF52-6CD6-40A5-AB3C-68EB2F1E4D0A}"/>
-    </a:ext>
-  </a:extLst>
 </a:theme>
 </file>
</xml_diff>